<commit_message>
Add LightGBM as a third ensemble member alongside ANN and GNN
Extends the soft-voting ensemble from 2 legs (ANN + GNN) to 3 legs
(ANN + LightGBM + GNN), keeping ANN in the architecture so it still
matches the existing project report/documentation. LightGBM improves
tuned-run precision from 0.056 to 0.191, F1 from 0.103 to 0.268, and
PR-AUC from 0.051 to 0.154 on the 1:150 evaluation run, with a recall
tradeoff (0.625 -> 0.448) from the tighter threshold.

- src/ensemble.py: 3-way simplex weight search + per-leg calibration
- src/train.py, src/predict.py, main.py, app.py: wire in ANN + LightGBM + GNN
- src/lgbm_model.py: new LightGBM model config
- Retrained and committed the tuned run_parent_1_150_tuned artifacts
- Updated README and docs to describe the 3-model architecture and
  document before/after numbers
</commit_message>
<xml_diff>
--- a/Project_Code_Documentation.docx
+++ b/Project_Code_Documentation.docx
@@ -12,7 +12,7 @@
     </w:p>
     <w:p>
       <w:r>
-        <w:t xml:space="preserve">Generated: 2026-08-13 07:28:51</w:t>
+        <w:t xml:space="preserve">Generated: 2026-08-13 08:15:34</w:t>
       </w:r>
     </w:p>
     <w:p>
@@ -723,7 +723,7 @@
     </w:p>
     <w:p>
       <w:r>
-        <w:t xml:space="preserve">- src/: model + pipeline code (loader, ANN, GNN, ensemble, training)</w:t>
+        <w:t xml:space="preserve">- src/: model + pipeline code (loader, ANN, LightGBM, GNN, ensemble, training)</w:t>
       </w:r>
     </w:p>
     <w:p>
@@ -803,6 +803,11 @@
     </w:p>
     <w:p>
       <w:r>
+        <w:t xml:space="preserve">- src\lgbm_model.py</w:t>
+      </w:r>
+    </w:p>
+    <w:p>
+      <w:r>
         <w:t xml:space="preserve">- src\plots.py</w:t>
       </w:r>
     </w:p>
@@ -1177,7 +1182,7 @@
           <w:sz w:val="20"/>
           <w:szCs w:val="20"/>
         </w:rPr>
-        <w:t xml:space="preserve">st.caption("ANN + GNN + Soft Voting Ensemble")</w:t>
+        <w:t xml:space="preserve">st.caption("ANN + LightGBM + GNN + Soft Voting Ensemble")</w:t>
       </w:r>
     </w:p>
     <w:p>
@@ -5610,7 +5615,7 @@
           <w:sz w:val="20"/>
           <w:szCs w:val="20"/>
         </w:rPr>
-        <w:t xml:space="preserve">5. Model training using ANN and GNN</w:t>
+        <w:t xml:space="preserve">5. Model training using ANN, LightGBM, and GNN</w:t>
       </w:r>
     </w:p>
     <w:p>
@@ -6689,7 +6694,7 @@
           <w:sz w:val="20"/>
           <w:szCs w:val="20"/>
         </w:rPr>
-        <w:t xml:space="preserve">- numeric scaling helps ANN training stability</w:t>
+        <w:t xml:space="preserve">- numeric scaling helps ANN training stability; LightGBM doesn't strictly require it, but the shared preprocessor keeps the pipeline and the GNN's transaction-feature inputs consistent</w:t>
       </w:r>
     </w:p>
     <w:p>
@@ -7365,6 +7370,253 @@
           <w:sz w:val="20"/>
           <w:szCs w:val="20"/>
         </w:rPr>
+        <w:t xml:space="preserve">### LightGBM</w:t>
+      </w:r>
+    </w:p>
+    <w:p>
+      <w:pPr>
+        <w:spacing w:before="0" w:after="0"/>
+      </w:pPr>
+      <w:r>
+        <w:rPr>
+          <w:rFonts w:ascii="Consolas" w:hAnsi="Consolas" w:cs="Consolas"/>
+          <w:sz w:val="20"/>
+          <w:szCs w:val="20"/>
+        </w:rPr>
+        <w:t xml:space="preserve"/>
+      </w:r>
+    </w:p>
+    <w:p>
+      <w:pPr>
+        <w:spacing w:before="0" w:after="0"/>
+      </w:pPr>
+      <w:r>
+        <w:rPr>
+          <w:rFonts w:ascii="Consolas" w:hAnsi="Consolas" w:cs="Consolas"/>
+          <w:sz w:val="20"/>
+          <w:szCs w:val="20"/>
+        </w:rPr>
+        <w:t xml:space="preserve">Implemented in [src/lgbm_model.py](../src/lgbm_model.py).</w:t>
+      </w:r>
+    </w:p>
+    <w:p>
+      <w:pPr>
+        <w:spacing w:before="0" w:after="0"/>
+      </w:pPr>
+      <w:r>
+        <w:rPr>
+          <w:rFonts w:ascii="Consolas" w:hAnsi="Consolas" w:cs="Consolas"/>
+          <w:sz w:val="20"/>
+          <w:szCs w:val="20"/>
+        </w:rPr>
+        <w:t xml:space="preserve"/>
+      </w:r>
+    </w:p>
+    <w:p>
+      <w:pPr>
+        <w:spacing w:before="0" w:after="0"/>
+      </w:pPr>
+      <w:r>
+        <w:rPr>
+          <w:rFonts w:ascii="Consolas" w:hAnsi="Consolas" w:cs="Consolas"/>
+          <w:sz w:val="20"/>
+          <w:szCs w:val="20"/>
+        </w:rPr>
+        <w:t xml:space="preserve">Purpose:</w:t>
+      </w:r>
+    </w:p>
+    <w:p>
+      <w:pPr>
+        <w:spacing w:before="0" w:after="0"/>
+      </w:pPr>
+      <w:r>
+        <w:rPr>
+          <w:rFonts w:ascii="Consolas" w:hAnsi="Consolas" w:cs="Consolas"/>
+          <w:sz w:val="20"/>
+          <w:szCs w:val="20"/>
+        </w:rPr>
+        <w:t xml:space="preserve"/>
+      </w:r>
+    </w:p>
+    <w:p>
+      <w:pPr>
+        <w:spacing w:before="0" w:after="0"/>
+      </w:pPr>
+      <w:r>
+        <w:rPr>
+          <w:rFonts w:ascii="Consolas" w:hAnsi="Consolas" w:cs="Consolas"/>
+          <w:sz w:val="20"/>
+          <w:szCs w:val="20"/>
+        </w:rPr>
+        <w:t xml:space="preserve">- learn tabular transaction patterns, as a second model alongside the ANN</w:t>
+      </w:r>
+    </w:p>
+    <w:p>
+      <w:pPr>
+        <w:spacing w:before="0" w:after="0"/>
+      </w:pPr>
+      <w:r>
+        <w:rPr>
+          <w:rFonts w:ascii="Consolas" w:hAnsi="Consolas" w:cs="Consolas"/>
+          <w:sz w:val="20"/>
+          <w:szCs w:val="20"/>
+        </w:rPr>
+        <w:t xml:space="preserve"/>
+      </w:r>
+    </w:p>
+    <w:p>
+      <w:pPr>
+        <w:spacing w:before="0" w:after="0"/>
+      </w:pPr>
+      <w:r>
+        <w:rPr>
+          <w:rFonts w:ascii="Consolas" w:hAnsi="Consolas" w:cs="Consolas"/>
+          <w:sz w:val="20"/>
+          <w:szCs w:val="20"/>
+        </w:rPr>
+        <w:t xml:space="preserve">Input:</w:t>
+      </w:r>
+    </w:p>
+    <w:p>
+      <w:pPr>
+        <w:spacing w:before="0" w:after="0"/>
+      </w:pPr>
+      <w:r>
+        <w:rPr>
+          <w:rFonts w:ascii="Consolas" w:hAnsi="Consolas" w:cs="Consolas"/>
+          <w:sz w:val="20"/>
+          <w:szCs w:val="20"/>
+        </w:rPr>
+        <w:t xml:space="preserve"/>
+      </w:r>
+    </w:p>
+    <w:p>
+      <w:pPr>
+        <w:spacing w:before="0" w:after="0"/>
+      </w:pPr>
+      <w:r>
+        <w:rPr>
+          <w:rFonts w:ascii="Consolas" w:hAnsi="Consolas" w:cs="Consolas"/>
+          <w:sz w:val="20"/>
+          <w:szCs w:val="20"/>
+        </w:rPr>
+        <w:t xml:space="preserve">- scaled numeric features</w:t>
+      </w:r>
+    </w:p>
+    <w:p>
+      <w:pPr>
+        <w:spacing w:before="0" w:after="0"/>
+      </w:pPr>
+      <w:r>
+        <w:rPr>
+          <w:rFonts w:ascii="Consolas" w:hAnsi="Consolas" w:cs="Consolas"/>
+          <w:sz w:val="20"/>
+          <w:szCs w:val="20"/>
+        </w:rPr>
+        <w:t xml:space="preserve">- hashed categorical features</w:t>
+      </w:r>
+    </w:p>
+    <w:p>
+      <w:pPr>
+        <w:spacing w:before="0" w:after="0"/>
+      </w:pPr>
+      <w:r>
+        <w:rPr>
+          <w:rFonts w:ascii="Consolas" w:hAnsi="Consolas" w:cs="Consolas"/>
+          <w:sz w:val="20"/>
+          <w:szCs w:val="20"/>
+        </w:rPr>
+        <w:t xml:space="preserve"/>
+      </w:r>
+    </w:p>
+    <w:p>
+      <w:pPr>
+        <w:spacing w:before="0" w:after="0"/>
+      </w:pPr>
+      <w:r>
+        <w:rPr>
+          <w:rFonts w:ascii="Consolas" w:hAnsi="Consolas" w:cs="Consolas"/>
+          <w:sz w:val="20"/>
+          <w:szCs w:val="20"/>
+        </w:rPr>
+        <w:t xml:space="preserve">Output:</w:t>
+      </w:r>
+    </w:p>
+    <w:p>
+      <w:pPr>
+        <w:spacing w:before="0" w:after="0"/>
+      </w:pPr>
+      <w:r>
+        <w:rPr>
+          <w:rFonts w:ascii="Consolas" w:hAnsi="Consolas" w:cs="Consolas"/>
+          <w:sz w:val="20"/>
+          <w:szCs w:val="20"/>
+        </w:rPr>
+        <w:t xml:space="preserve"/>
+      </w:r>
+    </w:p>
+    <w:p>
+      <w:pPr>
+        <w:spacing w:before="0" w:after="0"/>
+      </w:pPr>
+      <w:r>
+        <w:rPr>
+          <w:rFonts w:ascii="Consolas" w:hAnsi="Consolas" w:cs="Consolas"/>
+          <w:sz w:val="20"/>
+          <w:szCs w:val="20"/>
+        </w:rPr>
+        <w:t xml:space="preserve">- a laundering probability for each transaction</w:t>
+      </w:r>
+    </w:p>
+    <w:p>
+      <w:pPr>
+        <w:spacing w:before="0" w:after="0"/>
+      </w:pPr>
+      <w:r>
+        <w:rPr>
+          <w:rFonts w:ascii="Consolas" w:hAnsi="Consolas" w:cs="Consolas"/>
+          <w:sz w:val="20"/>
+          <w:szCs w:val="20"/>
+        </w:rPr>
+        <w:t xml:space="preserve"/>
+      </w:r>
+    </w:p>
+    <w:p>
+      <w:pPr>
+        <w:spacing w:before="0" w:after="0"/>
+      </w:pPr>
+      <w:r>
+        <w:rPr>
+          <w:rFonts w:ascii="Consolas" w:hAnsi="Consolas" w:cs="Consolas"/>
+          <w:sz w:val="20"/>
+          <w:szCs w:val="20"/>
+        </w:rPr>
+        <w:t xml:space="preserve">Note: LightGBM was added as a third ensemble member alongside the existing ANN + GNN system, not as a replacement. ANN and LightGBM consume identical input features, so gradient-boosted trees' typically stronger standalone precision on tabular fraud-style data is what lifts the 3-way ensemble, not diversity of inputs.</w:t>
+      </w:r>
+    </w:p>
+    <w:p>
+      <w:pPr>
+        <w:spacing w:before="0" w:after="0"/>
+      </w:pPr>
+      <w:r>
+        <w:rPr>
+          <w:rFonts w:ascii="Consolas" w:hAnsi="Consolas" w:cs="Consolas"/>
+          <w:sz w:val="20"/>
+          <w:szCs w:val="20"/>
+        </w:rPr>
+        <w:t xml:space="preserve"/>
+      </w:r>
+    </w:p>
+    <w:p>
+      <w:pPr>
+        <w:spacing w:before="0" w:after="0"/>
+      </w:pPr>
+      <w:r>
+        <w:rPr>
+          <w:rFonts w:ascii="Consolas" w:hAnsi="Consolas" w:cs="Consolas"/>
+          <w:sz w:val="20"/>
+          <w:szCs w:val="20"/>
+        </w:rPr>
         <w:t xml:space="preserve">### GNN</w:t>
       </w:r>
     </w:p>
@@ -7768,6 +8020,19 @@
           <w:sz w:val="20"/>
           <w:szCs w:val="20"/>
         </w:rPr>
+        <w:t xml:space="preserve">- LightGBM produces probability \(p_{lgbm}\)</w:t>
+      </w:r>
+    </w:p>
+    <w:p>
+      <w:pPr>
+        <w:spacing w:before="0" w:after="0"/>
+      </w:pPr>
+      <w:r>
+        <w:rPr>
+          <w:rFonts w:ascii="Consolas" w:hAnsi="Consolas" w:cs="Consolas"/>
+          <w:sz w:val="20"/>
+          <w:szCs w:val="20"/>
+        </w:rPr>
         <w:t xml:space="preserve">- GNN produces probability \(p_{gnn}\)</w:t>
       </w:r>
     </w:p>
@@ -7781,7 +8046,7 @@
           <w:sz w:val="20"/>
           <w:szCs w:val="20"/>
         </w:rPr>
-        <w:t xml:space="preserve">- final ensemble probability is a weighted combination of both</w:t>
+        <w:t xml:space="preserve">- final ensemble probability is a weighted combination of all three</w:t>
       </w:r>
     </w:p>
     <w:p>
@@ -10082,7 +10347,7 @@
           <w:sz w:val="20"/>
           <w:szCs w:val="20"/>
         </w:rPr>
-        <w:t xml:space="preserve">If ANN weight is \(w_{ann}\) and GNN weight is \(w_{gnn}\):</w:t>
+        <w:t xml:space="preserve">If ANN weight is \(w_{ann}\), LightGBM weight is \(w_{lgbm}\), and GNN weight is \(w_{gnn}\):</w:t>
       </w:r>
     </w:p>
     <w:p>
@@ -10121,7 +10386,7 @@
           <w:sz w:val="20"/>
           <w:szCs w:val="20"/>
         </w:rPr>
-        <w:t xml:space="preserve">p_{ensemble} = \frac{w_{ann} \cdot p_{ann} + w_{gnn} \cdot p_{gnn}}{w_{ann} + w_{gnn}}</w:t>
+        <w:t xml:space="preserve">p_{ensemble} = \frac{w_{ann} \cdot p_{ann} + w_{lgbm} \cdot p_{lgbm} + w_{gnn} \cdot p_{gnn}}{w_{ann} + w_{lgbm} + w_{gnn}}</w:t>
       </w:r>
     </w:p>
     <w:p>
@@ -10186,7 +10451,7 @@
           <w:sz w:val="20"/>
           <w:szCs w:val="20"/>
         </w:rPr>
-        <w:t xml:space="preserve">- combine two model outputs into one ensemble probability</w:t>
+        <w:t xml:space="preserve">- combine three model outputs into one ensemble probability, with weights searched on a 3-way simplex grid</w:t>
       </w:r>
     </w:p>
     <w:p>
@@ -11200,7 +11465,7 @@
           <w:sz w:val="20"/>
           <w:szCs w:val="20"/>
         </w:rPr>
-        <w:t xml:space="preserve">3. Train ANN and GNN separately</w:t>
+        <w:t xml:space="preserve">3. Train ANN, LightGBM, and GNN separately</w:t>
       </w:r>
     </w:p>
     <w:p>
@@ -11395,7 +11660,7 @@
           <w:sz w:val="20"/>
           <w:szCs w:val="20"/>
         </w:rPr>
-        <w:t xml:space="preserve">3. “We trained two models: ANN for tabular behavior and GNN for relational patterns.”</w:t>
+        <w:t xml:space="preserve">3. “We trained three models: ANN and LightGBM for tabular behavior, and GNN for relational patterns.”</w:t>
       </w:r>
     </w:p>
     <w:p>
@@ -11564,7 +11829,7 @@
           <w:sz w:val="20"/>
           <w:szCs w:val="20"/>
         </w:rPr>
-        <w:t xml:space="preserve">- using ANN + GNN + soft voting</w:t>
+        <w:t xml:space="preserve">- using ANN + LightGBM + GNN + soft voting</w:t>
       </w:r>
     </w:p>
     <w:p>
@@ -11746,6 +12011,19 @@
           <w:sz w:val="20"/>
           <w:szCs w:val="20"/>
         </w:rPr>
+        <w:t xml:space="preserve">- LightGBM (gradient-boosted trees) for tabular transaction behavior, added alongside the ANN to improve precision</w:t>
+      </w:r>
+    </w:p>
+    <w:p>
+      <w:pPr>
+        <w:spacing w:before="0" w:after="0"/>
+      </w:pPr>
+      <w:r>
+        <w:rPr>
+          <w:rFonts w:ascii="Consolas" w:hAnsi="Consolas" w:cs="Consolas"/>
+          <w:sz w:val="20"/>
+          <w:szCs w:val="20"/>
+        </w:rPr>
         <w:t xml:space="preserve">- GNN (Graph Neural Network) for account-to-account network structure</w:t>
       </w:r>
     </w:p>
@@ -11759,7 +12037,7 @@
           <w:sz w:val="20"/>
           <w:szCs w:val="20"/>
         </w:rPr>
-        <w:t xml:space="preserve">- Ensemble learning via soft voting over ANN and GNN probabilities</w:t>
+        <w:t xml:space="preserve">- Ensemble learning via soft voting over ANN, LightGBM, and GNN probabilities</w:t>
       </w:r>
     </w:p>
     <w:p>
@@ -11798,6 +12076,32 @@
           <w:sz w:val="20"/>
           <w:szCs w:val="20"/>
         </w:rPr>
+        <w:t xml:space="preserve">Note: LightGBM was added later as a third ensemble member, not a replacement for the ANN. Both tabular models train on the same input features, but LightGBM (gradient-boosted trees) tends to outperform a small feed-forward net on tabular fraud-style data, so its addition lifts overall ensemble precision while the ANN + GNN + ensemble architecture described in earlier project write-ups remains intact. See section 10.5 for before/after numbers.</w:t>
+      </w:r>
+    </w:p>
+    <w:p>
+      <w:pPr>
+        <w:spacing w:before="0" w:after="0"/>
+      </w:pPr>
+      <w:r>
+        <w:rPr>
+          <w:rFonts w:ascii="Consolas" w:hAnsi="Consolas" w:cs="Consolas"/>
+          <w:sz w:val="20"/>
+          <w:szCs w:val="20"/>
+        </w:rPr>
+        <w:t xml:space="preserve"/>
+      </w:r>
+    </w:p>
+    <w:p>
+      <w:pPr>
+        <w:spacing w:before="0" w:after="0"/>
+      </w:pPr>
+      <w:r>
+        <w:rPr>
+          <w:rFonts w:ascii="Consolas" w:hAnsi="Consolas" w:cs="Consolas"/>
+          <w:sz w:val="20"/>
+          <w:szCs w:val="20"/>
+        </w:rPr>
         <w:t xml:space="preserve">The project started on the original highly imbalanced dataset and then expanded into:</w:t>
       </w:r>
     </w:p>
@@ -12266,6 +12570,19 @@
           <w:sz w:val="20"/>
           <w:szCs w:val="20"/>
         </w:rPr>
+        <w:t xml:space="preserve">- `src/lgbm_model.py`: LightGBM model config</w:t>
+      </w:r>
+    </w:p>
+    <w:p>
+      <w:pPr>
+        <w:spacing w:before="0" w:after="0"/>
+      </w:pPr>
+      <w:r>
+        <w:rPr>
+          <w:rFonts w:ascii="Consolas" w:hAnsi="Consolas" w:cs="Consolas"/>
+          <w:sz w:val="20"/>
+          <w:szCs w:val="20"/>
+        </w:rPr>
         <w:t xml:space="preserve">- `src/gnn.py`: GNN architecture</w:t>
       </w:r>
     </w:p>
@@ -14099,7 +14416,7 @@
           <w:sz w:val="20"/>
           <w:szCs w:val="20"/>
         </w:rPr>
-        <w:t xml:space="preserve">## 6.2 GNN</w:t>
+        <w:t xml:space="preserve">## 6.2 LightGBM</w:t>
       </w:r>
     </w:p>
     <w:p>
@@ -14151,6 +14468,227 @@
           <w:sz w:val="20"/>
           <w:szCs w:val="20"/>
         </w:rPr>
+        <w:t xml:space="preserve">- learn tabular transaction patterns, as a second model alongside the ANN</w:t>
+      </w:r>
+    </w:p>
+    <w:p>
+      <w:pPr>
+        <w:spacing w:before="0" w:after="0"/>
+      </w:pPr>
+      <w:r>
+        <w:rPr>
+          <w:rFonts w:ascii="Consolas" w:hAnsi="Consolas" w:cs="Consolas"/>
+          <w:sz w:val="20"/>
+          <w:szCs w:val="20"/>
+        </w:rPr>
+        <w:t xml:space="preserve"/>
+      </w:r>
+    </w:p>
+    <w:p>
+      <w:pPr>
+        <w:spacing w:before="0" w:after="0"/>
+      </w:pPr>
+      <w:r>
+        <w:rPr>
+          <w:rFonts w:ascii="Consolas" w:hAnsi="Consolas" w:cs="Consolas"/>
+          <w:sz w:val="20"/>
+          <w:szCs w:val="20"/>
+        </w:rPr>
+        <w:t xml:space="preserve">Structure:</w:t>
+      </w:r>
+    </w:p>
+    <w:p>
+      <w:pPr>
+        <w:spacing w:before="0" w:after="0"/>
+      </w:pPr>
+      <w:r>
+        <w:rPr>
+          <w:rFonts w:ascii="Consolas" w:hAnsi="Consolas" w:cs="Consolas"/>
+          <w:sz w:val="20"/>
+          <w:szCs w:val="20"/>
+        </w:rPr>
+        <w:t xml:space="preserve"/>
+      </w:r>
+    </w:p>
+    <w:p>
+      <w:pPr>
+        <w:spacing w:before="0" w:after="0"/>
+      </w:pPr>
+      <w:r>
+        <w:rPr>
+          <w:rFonts w:ascii="Consolas" w:hAnsi="Consolas" w:cs="Consolas"/>
+          <w:sz w:val="20"/>
+          <w:szCs w:val="20"/>
+        </w:rPr>
+        <w:t xml:space="preserve">- gradient-boosted decision tree ensemble (`LGBMClassifier`)</w:t>
+      </w:r>
+    </w:p>
+    <w:p>
+      <w:pPr>
+        <w:spacing w:before="0" w:after="0"/>
+      </w:pPr>
+      <w:r>
+        <w:rPr>
+          <w:rFonts w:ascii="Consolas" w:hAnsi="Consolas" w:cs="Consolas"/>
+          <w:sz w:val="20"/>
+          <w:szCs w:val="20"/>
+        </w:rPr>
+        <w:t xml:space="preserve">- class imbalance handled via `scale_pos_weight`</w:t>
+      </w:r>
+    </w:p>
+    <w:p>
+      <w:pPr>
+        <w:spacing w:before="0" w:after="0"/>
+      </w:pPr>
+      <w:r>
+        <w:rPr>
+          <w:rFonts w:ascii="Consolas" w:hAnsi="Consolas" w:cs="Consolas"/>
+          <w:sz w:val="20"/>
+          <w:szCs w:val="20"/>
+        </w:rPr>
+        <w:t xml:space="preserve">- outputs a single probability score per transaction</w:t>
+      </w:r>
+    </w:p>
+    <w:p>
+      <w:pPr>
+        <w:spacing w:before="0" w:after="0"/>
+      </w:pPr>
+      <w:r>
+        <w:rPr>
+          <w:rFonts w:ascii="Consolas" w:hAnsi="Consolas" w:cs="Consolas"/>
+          <w:sz w:val="20"/>
+          <w:szCs w:val="20"/>
+        </w:rPr>
+        <w:t xml:space="preserve"/>
+      </w:r>
+    </w:p>
+    <w:p>
+      <w:pPr>
+        <w:spacing w:before="0" w:after="0"/>
+      </w:pPr>
+      <w:r>
+        <w:rPr>
+          <w:rFonts w:ascii="Consolas" w:hAnsi="Consolas" w:cs="Consolas"/>
+          <w:sz w:val="20"/>
+          <w:szCs w:val="20"/>
+        </w:rPr>
+        <w:t xml:space="preserve">Why LightGBM was added:</w:t>
+      </w:r>
+    </w:p>
+    <w:p>
+      <w:pPr>
+        <w:spacing w:before="0" w:after="0"/>
+      </w:pPr>
+      <w:r>
+        <w:rPr>
+          <w:rFonts w:ascii="Consolas" w:hAnsi="Consolas" w:cs="Consolas"/>
+          <w:sz w:val="20"/>
+          <w:szCs w:val="20"/>
+        </w:rPr>
+        <w:t xml:space="preserve"/>
+      </w:r>
+    </w:p>
+    <w:p>
+      <w:pPr>
+        <w:spacing w:before="0" w:after="0"/>
+      </w:pPr>
+      <w:r>
+        <w:rPr>
+          <w:rFonts w:ascii="Consolas" w:hAnsi="Consolas" w:cs="Consolas"/>
+          <w:sz w:val="20"/>
+          <w:szCs w:val="20"/>
+        </w:rPr>
+        <w:t xml:space="preserve">- gradient-boosted trees generally outperform small feed-forward nets on tabular fraud-style data</w:t>
+      </w:r>
+    </w:p>
+    <w:p>
+      <w:pPr>
+        <w:spacing w:before="0" w:after="0"/>
+      </w:pPr>
+      <w:r>
+        <w:rPr>
+          <w:rFonts w:ascii="Consolas" w:hAnsi="Consolas" w:cs="Consolas"/>
+          <w:sz w:val="20"/>
+          <w:szCs w:val="20"/>
+        </w:rPr>
+        <w:t xml:space="preserve">- ANN and LightGBM train on the exact same feature set, so their errors correlate somewhat, but LightGBM's stronger standalone precision still lifts the 3-way ensemble beyond what ANN + GNN alone achieved</w:t>
+      </w:r>
+    </w:p>
+    <w:p>
+      <w:pPr>
+        <w:spacing w:before="0" w:after="0"/>
+      </w:pPr>
+      <w:r>
+        <w:rPr>
+          <w:rFonts w:ascii="Consolas" w:hAnsi="Consolas" w:cs="Consolas"/>
+          <w:sz w:val="20"/>
+          <w:szCs w:val="20"/>
+        </w:rPr>
+        <w:t xml:space="preserve"/>
+      </w:r>
+    </w:p>
+    <w:p>
+      <w:pPr>
+        <w:spacing w:before="0" w:after="0"/>
+      </w:pPr>
+      <w:r>
+        <w:rPr>
+          <w:rFonts w:ascii="Consolas" w:hAnsi="Consolas" w:cs="Consolas"/>
+          <w:sz w:val="20"/>
+          <w:szCs w:val="20"/>
+        </w:rPr>
+        <w:t xml:space="preserve">## 6.3 GNN</w:t>
+      </w:r>
+    </w:p>
+    <w:p>
+      <w:pPr>
+        <w:spacing w:before="0" w:after="0"/>
+      </w:pPr>
+      <w:r>
+        <w:rPr>
+          <w:rFonts w:ascii="Consolas" w:hAnsi="Consolas" w:cs="Consolas"/>
+          <w:sz w:val="20"/>
+          <w:szCs w:val="20"/>
+        </w:rPr>
+        <w:t xml:space="preserve"/>
+      </w:r>
+    </w:p>
+    <w:p>
+      <w:pPr>
+        <w:spacing w:before="0" w:after="0"/>
+      </w:pPr>
+      <w:r>
+        <w:rPr>
+          <w:rFonts w:ascii="Consolas" w:hAnsi="Consolas" w:cs="Consolas"/>
+          <w:sz w:val="20"/>
+          <w:szCs w:val="20"/>
+        </w:rPr>
+        <w:t xml:space="preserve">Purpose:</w:t>
+      </w:r>
+    </w:p>
+    <w:p>
+      <w:pPr>
+        <w:spacing w:before="0" w:after="0"/>
+      </w:pPr>
+      <w:r>
+        <w:rPr>
+          <w:rFonts w:ascii="Consolas" w:hAnsi="Consolas" w:cs="Consolas"/>
+          <w:sz w:val="20"/>
+          <w:szCs w:val="20"/>
+        </w:rPr>
+        <w:t xml:space="preserve"/>
+      </w:r>
+    </w:p>
+    <w:p>
+      <w:pPr>
+        <w:spacing w:before="0" w:after="0"/>
+      </w:pPr>
+      <w:r>
+        <w:rPr>
+          <w:rFonts w:ascii="Consolas" w:hAnsi="Consolas" w:cs="Consolas"/>
+          <w:sz w:val="20"/>
+          <w:szCs w:val="20"/>
+        </w:rPr>
         <w:t xml:space="preserve">- learn network patterns between accounts</w:t>
       </w:r>
     </w:p>
@@ -14281,7 +14819,7 @@
           <w:sz w:val="20"/>
           <w:szCs w:val="20"/>
         </w:rPr>
-        <w:t xml:space="preserve">## 6.3 Ensemble</w:t>
+        <w:t xml:space="preserve">## 6.4 Ensemble</w:t>
       </w:r>
     </w:p>
     <w:p>
@@ -14333,7 +14871,7 @@
           <w:sz w:val="20"/>
           <w:szCs w:val="20"/>
         </w:rPr>
-        <w:t xml:space="preserve">- combine ANN and GNN outputs into a final probability</w:t>
+        <w:t xml:space="preserve">- combine ANN, LightGBM, and GNN outputs into a final probability</w:t>
       </w:r>
     </w:p>
     <w:p>
@@ -14385,33 +14923,33 @@
           <w:sz w:val="20"/>
           <w:szCs w:val="20"/>
         </w:rPr>
-        <w:t xml:space="preserve">- soft voting</w:t>
-      </w:r>
-    </w:p>
-    <w:p>
-      <w:pPr>
-        <w:spacing w:before="0" w:after="0"/>
-      </w:pPr>
-      <w:r>
-        <w:rPr>
-          <w:rFonts w:ascii="Consolas" w:hAnsi="Consolas" w:cs="Consolas"/>
-          <w:sz w:val="20"/>
-          <w:szCs w:val="20"/>
-        </w:rPr>
-        <w:t xml:space="preserve">- learned weights over ANN/GNN probabilities</w:t>
-      </w:r>
-    </w:p>
-    <w:p>
-      <w:pPr>
-        <w:spacing w:before="0" w:after="0"/>
-      </w:pPr>
-      <w:r>
-        <w:rPr>
-          <w:rFonts w:ascii="Consolas" w:hAnsi="Consolas" w:cs="Consolas"/>
-          <w:sz w:val="20"/>
-          <w:szCs w:val="20"/>
-        </w:rPr>
-        <w:t xml:space="preserve">- optional probability transformation</w:t>
+        <w:t xml:space="preserve">- soft voting across three legs (ANN, LightGBM, GNN)</w:t>
+      </w:r>
+    </w:p>
+    <w:p>
+      <w:pPr>
+        <w:spacing w:before="0" w:after="0"/>
+      </w:pPr>
+      <w:r>
+        <w:rPr>
+          <w:rFonts w:ascii="Consolas" w:hAnsi="Consolas" w:cs="Consolas"/>
+          <w:sz w:val="20"/>
+          <w:szCs w:val="20"/>
+        </w:rPr>
+        <w:t xml:space="preserve">- learned weights over ANN/LightGBM/GNN probabilities (searched on a 3-way weight simplex)</w:t>
+      </w:r>
+    </w:p>
+    <w:p>
+      <w:pPr>
+        <w:spacing w:before="0" w:after="0"/>
+      </w:pPr>
+      <w:r>
+        <w:rPr>
+          <w:rFonts w:ascii="Consolas" w:hAnsi="Consolas" w:cs="Consolas"/>
+          <w:sz w:val="20"/>
+          <w:szCs w:val="20"/>
+        </w:rPr>
+        <w:t xml:space="preserve">- optional probability transformation per leg</w:t>
       </w:r>
     </w:p>
     <w:p>
@@ -16088,6 +16626,19 @@
           <w:sz w:val="20"/>
           <w:szCs w:val="20"/>
         </w:rPr>
+        <w:t xml:space="preserve">- LightGBM metrics</w:t>
+      </w:r>
+    </w:p>
+    <w:p>
+      <w:pPr>
+        <w:spacing w:before="0" w:after="0"/>
+      </w:pPr>
+      <w:r>
+        <w:rPr>
+          <w:rFonts w:ascii="Consolas" w:hAnsi="Consolas" w:cs="Consolas"/>
+          <w:sz w:val="20"/>
+          <w:szCs w:val="20"/>
+        </w:rPr>
         <w:t xml:space="preserve">- GNN metrics</w:t>
       </w:r>
     </w:p>
@@ -16647,6 +17198,32 @@
           <w:sz w:val="20"/>
           <w:szCs w:val="20"/>
         </w:rPr>
+        <w:t xml:space="preserve">Sections 10.1–10.5 are historical results from the ANN + GNN 2-model ensemble (before LightGBM was added), kept for the experimental record. Section 10.6 reflects the current ANN + LightGBM + GNN 3-model ensemble (see section 1 and 6.2 for why LightGBM was added).</w:t>
+      </w:r>
+    </w:p>
+    <w:p>
+      <w:pPr>
+        <w:spacing w:before="0" w:after="0"/>
+      </w:pPr>
+      <w:r>
+        <w:rPr>
+          <w:rFonts w:ascii="Consolas" w:hAnsi="Consolas" w:cs="Consolas"/>
+          <w:sz w:val="20"/>
+          <w:szCs w:val="20"/>
+        </w:rPr>
+        <w:t xml:space="preserve"/>
+      </w:r>
+    </w:p>
+    <w:p>
+      <w:pPr>
+        <w:spacing w:before="0" w:after="0"/>
+      </w:pPr>
+      <w:r>
+        <w:rPr>
+          <w:rFonts w:ascii="Consolas" w:hAnsi="Consolas" w:cs="Consolas"/>
+          <w:sz w:val="20"/>
+          <w:szCs w:val="20"/>
+        </w:rPr>
         <w:t xml:space="preserve">## 10.1 Earlier Baseline on Original Parent Distribution</w:t>
       </w:r>
     </w:p>
@@ -17414,33 +17991,33 @@
           <w:sz w:val="20"/>
           <w:szCs w:val="20"/>
         </w:rPr>
-        <w:t xml:space="preserve">## 10.5 Tuned `1:150` Parent Evaluation Run</w:t>
-      </w:r>
-    </w:p>
-    <w:p>
-      <w:pPr>
-        <w:spacing w:before="0" w:after="0"/>
-      </w:pPr>
-      <w:r>
-        <w:rPr>
-          <w:rFonts w:ascii="Consolas" w:hAnsi="Consolas" w:cs="Consolas"/>
-          <w:sz w:val="20"/>
-          <w:szCs w:val="20"/>
-        </w:rPr>
-        <w:t xml:space="preserve"/>
-      </w:r>
-    </w:p>
-    <w:p>
-      <w:pPr>
-        <w:spacing w:before="0" w:after="0"/>
-      </w:pPr>
-      <w:r>
-        <w:rPr>
-          <w:rFonts w:ascii="Consolas" w:hAnsi="Consolas" w:cs="Consolas"/>
-          <w:sz w:val="20"/>
-          <w:szCs w:val="20"/>
-        </w:rPr>
-        <w:t xml:space="preserve">This is the current presentation-facing run.</w:t>
+        <w:t xml:space="preserve">## 10.5 Tuned `1:150` Parent Evaluation Run (Historical: ANN + GNN, pre-LightGBM)</w:t>
+      </w:r>
+    </w:p>
+    <w:p>
+      <w:pPr>
+        <w:spacing w:before="0" w:after="0"/>
+      </w:pPr>
+      <w:r>
+        <w:rPr>
+          <w:rFonts w:ascii="Consolas" w:hAnsi="Consolas" w:cs="Consolas"/>
+          <w:sz w:val="20"/>
+          <w:szCs w:val="20"/>
+        </w:rPr>
+        <w:t xml:space="preserve"/>
+      </w:r>
+    </w:p>
+    <w:p>
+      <w:pPr>
+        <w:spacing w:before="0" w:after="0"/>
+      </w:pPr>
+      <w:r>
+        <w:rPr>
+          <w:rFonts w:ascii="Consolas" w:hAnsi="Consolas" w:cs="Consolas"/>
+          <w:sz w:val="20"/>
+          <w:szCs w:val="20"/>
+        </w:rPr>
+        <w:t xml:space="preserve">This was the presentation-facing run before LightGBM was added as a third ensemble member. Kept for the experimental record and for before/after comparison against section 10.6.</w:t>
       </w:r>
     </w:p>
     <w:p>
@@ -17973,6 +18550,786 @@
           <w:sz w:val="20"/>
           <w:szCs w:val="20"/>
         </w:rPr>
+        <w:t xml:space="preserve">## 10.6 Tuned `1:150` Parent Evaluation Run (Current: ANN + LightGBM + GNN)</w:t>
+      </w:r>
+    </w:p>
+    <w:p>
+      <w:pPr>
+        <w:spacing w:before="0" w:after="0"/>
+      </w:pPr>
+      <w:r>
+        <w:rPr>
+          <w:rFonts w:ascii="Consolas" w:hAnsi="Consolas" w:cs="Consolas"/>
+          <w:sz w:val="20"/>
+          <w:szCs w:val="20"/>
+        </w:rPr>
+        <w:t xml:space="preserve"/>
+      </w:r>
+    </w:p>
+    <w:p>
+      <w:pPr>
+        <w:spacing w:before="0" w:after="0"/>
+      </w:pPr>
+      <w:r>
+        <w:rPr>
+          <w:rFonts w:ascii="Consolas" w:hAnsi="Consolas" w:cs="Consolas"/>
+          <w:sz w:val="20"/>
+          <w:szCs w:val="20"/>
+        </w:rPr>
+        <w:t xml:space="preserve">This is the current presentation-facing run, with LightGBM added as a third ensemble member alongside ANN and GNN.</w:t>
+      </w:r>
+    </w:p>
+    <w:p>
+      <w:pPr>
+        <w:spacing w:before="0" w:after="0"/>
+      </w:pPr>
+      <w:r>
+        <w:rPr>
+          <w:rFonts w:ascii="Consolas" w:hAnsi="Consolas" w:cs="Consolas"/>
+          <w:sz w:val="20"/>
+          <w:szCs w:val="20"/>
+        </w:rPr>
+        <w:t xml:space="preserve"/>
+      </w:r>
+    </w:p>
+    <w:p>
+      <w:pPr>
+        <w:spacing w:before="0" w:after="0"/>
+      </w:pPr>
+      <w:r>
+        <w:rPr>
+          <w:rFonts w:ascii="Consolas" w:hAnsi="Consolas" w:cs="Consolas"/>
+          <w:sz w:val="20"/>
+          <w:szCs w:val="20"/>
+        </w:rPr>
+        <w:t xml:space="preserve">Ensemble:</w:t>
+      </w:r>
+    </w:p>
+    <w:p>
+      <w:pPr>
+        <w:spacing w:before="0" w:after="0"/>
+      </w:pPr>
+      <w:r>
+        <w:rPr>
+          <w:rFonts w:ascii="Consolas" w:hAnsi="Consolas" w:cs="Consolas"/>
+          <w:sz w:val="20"/>
+          <w:szCs w:val="20"/>
+        </w:rPr>
+        <w:t xml:space="preserve"/>
+      </w:r>
+    </w:p>
+    <w:p>
+      <w:pPr>
+        <w:spacing w:before="0" w:after="0"/>
+      </w:pPr>
+      <w:r>
+        <w:rPr>
+          <w:rFonts w:ascii="Consolas" w:hAnsi="Consolas" w:cs="Consolas"/>
+          <w:sz w:val="20"/>
+          <w:szCs w:val="20"/>
+        </w:rPr>
+        <w:t xml:space="preserve">- accuracy: `0.9838`</w:t>
+      </w:r>
+    </w:p>
+    <w:p>
+      <w:pPr>
+        <w:spacing w:before="0" w:after="0"/>
+      </w:pPr>
+      <w:r>
+        <w:rPr>
+          <w:rFonts w:ascii="Consolas" w:hAnsi="Consolas" w:cs="Consolas"/>
+          <w:sz w:val="20"/>
+          <w:szCs w:val="20"/>
+        </w:rPr>
+        <w:t xml:space="preserve">- precision: `0.1909`</w:t>
+      </w:r>
+    </w:p>
+    <w:p>
+      <w:pPr>
+        <w:spacing w:before="0" w:after="0"/>
+      </w:pPr>
+      <w:r>
+        <w:rPr>
+          <w:rFonts w:ascii="Consolas" w:hAnsi="Consolas" w:cs="Consolas"/>
+          <w:sz w:val="20"/>
+          <w:szCs w:val="20"/>
+        </w:rPr>
+        <w:t xml:space="preserve">- recall: `0.4477`</w:t>
+      </w:r>
+    </w:p>
+    <w:p>
+      <w:pPr>
+        <w:spacing w:before="0" w:after="0"/>
+      </w:pPr>
+      <w:r>
+        <w:rPr>
+          <w:rFonts w:ascii="Consolas" w:hAnsi="Consolas" w:cs="Consolas"/>
+          <w:sz w:val="20"/>
+          <w:szCs w:val="20"/>
+        </w:rPr>
+        <w:t xml:space="preserve">- f1: `0.2676`</w:t>
+      </w:r>
+    </w:p>
+    <w:p>
+      <w:pPr>
+        <w:spacing w:before="0" w:after="0"/>
+      </w:pPr>
+      <w:r>
+        <w:rPr>
+          <w:rFonts w:ascii="Consolas" w:hAnsi="Consolas" w:cs="Consolas"/>
+          <w:sz w:val="20"/>
+          <w:szCs w:val="20"/>
+        </w:rPr>
+        <w:t xml:space="preserve">- auc: `0.9551`</w:t>
+      </w:r>
+    </w:p>
+    <w:p>
+      <w:pPr>
+        <w:spacing w:before="0" w:after="0"/>
+      </w:pPr>
+      <w:r>
+        <w:rPr>
+          <w:rFonts w:ascii="Consolas" w:hAnsi="Consolas" w:cs="Consolas"/>
+          <w:sz w:val="20"/>
+          <w:szCs w:val="20"/>
+        </w:rPr>
+        <w:t xml:space="preserve">- pr_auc: `0.1536`</w:t>
+      </w:r>
+    </w:p>
+    <w:p>
+      <w:pPr>
+        <w:spacing w:before="0" w:after="0"/>
+      </w:pPr>
+      <w:r>
+        <w:rPr>
+          <w:rFonts w:ascii="Consolas" w:hAnsi="Consolas" w:cs="Consolas"/>
+          <w:sz w:val="20"/>
+          <w:szCs w:val="20"/>
+        </w:rPr>
+        <w:t xml:space="preserve">- threshold: about `0.068`</w:t>
+      </w:r>
+    </w:p>
+    <w:p>
+      <w:pPr>
+        <w:spacing w:before="0" w:after="0"/>
+      </w:pPr>
+      <w:r>
+        <w:rPr>
+          <w:rFonts w:ascii="Consolas" w:hAnsi="Consolas" w:cs="Consolas"/>
+          <w:sz w:val="20"/>
+          <w:szCs w:val="20"/>
+        </w:rPr>
+        <w:t xml:space="preserve"/>
+      </w:r>
+    </w:p>
+    <w:p>
+      <w:pPr>
+        <w:spacing w:before="0" w:after="0"/>
+      </w:pPr>
+      <w:r>
+        <w:rPr>
+          <w:rFonts w:ascii="Consolas" w:hAnsi="Consolas" w:cs="Consolas"/>
+          <w:sz w:val="20"/>
+          <w:szCs w:val="20"/>
+        </w:rPr>
+        <w:t xml:space="preserve">Individual models:</w:t>
+      </w:r>
+    </w:p>
+    <w:p>
+      <w:pPr>
+        <w:spacing w:before="0" w:after="0"/>
+      </w:pPr>
+      <w:r>
+        <w:rPr>
+          <w:rFonts w:ascii="Consolas" w:hAnsi="Consolas" w:cs="Consolas"/>
+          <w:sz w:val="20"/>
+          <w:szCs w:val="20"/>
+        </w:rPr>
+        <w:t xml:space="preserve"/>
+      </w:r>
+    </w:p>
+    <w:p>
+      <w:pPr>
+        <w:spacing w:before="0" w:after="0"/>
+      </w:pPr>
+      <w:r>
+        <w:rPr>
+          <w:rFonts w:ascii="Consolas" w:hAnsi="Consolas" w:cs="Consolas"/>
+          <w:sz w:val="20"/>
+          <w:szCs w:val="20"/>
+        </w:rPr>
+        <w:t xml:space="preserve">- ANN:</w:t>
+      </w:r>
+    </w:p>
+    <w:p>
+      <w:pPr>
+        <w:spacing w:before="0" w:after="0"/>
+      </w:pPr>
+      <w:r>
+        <w:rPr>
+          <w:rFonts w:ascii="Consolas" w:hAnsi="Consolas" w:cs="Consolas"/>
+          <w:sz w:val="20"/>
+          <w:szCs w:val="20"/>
+        </w:rPr>
+        <w:t xml:space="preserve">  - accuracy: `0.9429`</w:t>
+      </w:r>
+    </w:p>
+    <w:p>
+      <w:pPr>
+        <w:spacing w:before="0" w:after="0"/>
+      </w:pPr>
+      <w:r>
+        <w:rPr>
+          <w:rFonts w:ascii="Consolas" w:hAnsi="Consolas" w:cs="Consolas"/>
+          <w:sz w:val="20"/>
+          <w:szCs w:val="20"/>
+        </w:rPr>
+        <w:t xml:space="preserve">  - precision: `0.0587`</w:t>
+      </w:r>
+    </w:p>
+    <w:p>
+      <w:pPr>
+        <w:spacing w:before="0" w:after="0"/>
+      </w:pPr>
+      <w:r>
+        <w:rPr>
+          <w:rFonts w:ascii="Consolas" w:hAnsi="Consolas" w:cs="Consolas"/>
+          <w:sz w:val="20"/>
+          <w:szCs w:val="20"/>
+        </w:rPr>
+        <w:t xml:space="preserve">  - recall: `0.5068`</w:t>
+      </w:r>
+    </w:p>
+    <w:p>
+      <w:pPr>
+        <w:spacing w:before="0" w:after="0"/>
+      </w:pPr>
+      <w:r>
+        <w:rPr>
+          <w:rFonts w:ascii="Consolas" w:hAnsi="Consolas" w:cs="Consolas"/>
+          <w:sz w:val="20"/>
+          <w:szCs w:val="20"/>
+        </w:rPr>
+        <w:t xml:space="preserve">  - f1: `0.1052`</w:t>
+      </w:r>
+    </w:p>
+    <w:p>
+      <w:pPr>
+        <w:spacing w:before="0" w:after="0"/>
+      </w:pPr>
+      <w:r>
+        <w:rPr>
+          <w:rFonts w:ascii="Consolas" w:hAnsi="Consolas" w:cs="Consolas"/>
+          <w:sz w:val="20"/>
+          <w:szCs w:val="20"/>
+        </w:rPr>
+        <w:t xml:space="preserve">  - auc: `0.9288`</w:t>
+      </w:r>
+    </w:p>
+    <w:p>
+      <w:pPr>
+        <w:spacing w:before="0" w:after="0"/>
+      </w:pPr>
+      <w:r>
+        <w:rPr>
+          <w:rFonts w:ascii="Consolas" w:hAnsi="Consolas" w:cs="Consolas"/>
+          <w:sz w:val="20"/>
+          <w:szCs w:val="20"/>
+        </w:rPr>
+        <w:t xml:space="preserve">- LightGBM:</w:t>
+      </w:r>
+    </w:p>
+    <w:p>
+      <w:pPr>
+        <w:spacing w:before="0" w:after="0"/>
+      </w:pPr>
+      <w:r>
+        <w:rPr>
+          <w:rFonts w:ascii="Consolas" w:hAnsi="Consolas" w:cs="Consolas"/>
+          <w:sz w:val="20"/>
+          <w:szCs w:val="20"/>
+        </w:rPr>
+        <w:t xml:space="preserve">  - accuracy: `0.9876`</w:t>
+      </w:r>
+    </w:p>
+    <w:p>
+      <w:pPr>
+        <w:spacing w:before="0" w:after="0"/>
+      </w:pPr>
+      <w:r>
+        <w:rPr>
+          <w:rFonts w:ascii="Consolas" w:hAnsi="Consolas" w:cs="Consolas"/>
+          <w:sz w:val="20"/>
+          <w:szCs w:val="20"/>
+        </w:rPr>
+        <w:t xml:space="preserve">  - precision: `0.2184`</w:t>
+      </w:r>
+    </w:p>
+    <w:p>
+      <w:pPr>
+        <w:spacing w:before="0" w:after="0"/>
+      </w:pPr>
+      <w:r>
+        <w:rPr>
+          <w:rFonts w:ascii="Consolas" w:hAnsi="Consolas" w:cs="Consolas"/>
+          <w:sz w:val="20"/>
+          <w:szCs w:val="20"/>
+        </w:rPr>
+        <w:t xml:space="preserve">  - recall: `0.3376`</w:t>
+      </w:r>
+    </w:p>
+    <w:p>
+      <w:pPr>
+        <w:spacing w:before="0" w:after="0"/>
+      </w:pPr>
+      <w:r>
+        <w:rPr>
+          <w:rFonts w:ascii="Consolas" w:hAnsi="Consolas" w:cs="Consolas"/>
+          <w:sz w:val="20"/>
+          <w:szCs w:val="20"/>
+        </w:rPr>
+        <w:t xml:space="preserve">  - f1: `0.2653`</w:t>
+      </w:r>
+    </w:p>
+    <w:p>
+      <w:pPr>
+        <w:spacing w:before="0" w:after="0"/>
+      </w:pPr>
+      <w:r>
+        <w:rPr>
+          <w:rFonts w:ascii="Consolas" w:hAnsi="Consolas" w:cs="Consolas"/>
+          <w:sz w:val="20"/>
+          <w:szCs w:val="20"/>
+        </w:rPr>
+        <w:t xml:space="preserve">  - auc: `0.9589`</w:t>
+      </w:r>
+    </w:p>
+    <w:p>
+      <w:pPr>
+        <w:spacing w:before="0" w:after="0"/>
+      </w:pPr>
+      <w:r>
+        <w:rPr>
+          <w:rFonts w:ascii="Consolas" w:hAnsi="Consolas" w:cs="Consolas"/>
+          <w:sz w:val="20"/>
+          <w:szCs w:val="20"/>
+        </w:rPr>
+        <w:t xml:space="preserve">- GNN:</w:t>
+      </w:r>
+    </w:p>
+    <w:p>
+      <w:pPr>
+        <w:spacing w:before="0" w:after="0"/>
+      </w:pPr>
+      <w:r>
+        <w:rPr>
+          <w:rFonts w:ascii="Consolas" w:hAnsi="Consolas" w:cs="Consolas"/>
+          <w:sz w:val="20"/>
+          <w:szCs w:val="20"/>
+        </w:rPr>
+        <w:t xml:space="preserve">  - accuracy: `0.5344`</w:t>
+      </w:r>
+    </w:p>
+    <w:p>
+      <w:pPr>
+        <w:spacing w:before="0" w:after="0"/>
+      </w:pPr>
+      <w:r>
+        <w:rPr>
+          <w:rFonts w:ascii="Consolas" w:hAnsi="Consolas" w:cs="Consolas"/>
+          <w:sz w:val="20"/>
+          <w:szCs w:val="20"/>
+        </w:rPr>
+        <w:t xml:space="preserve">  - precision: `0.0110`</w:t>
+      </w:r>
+    </w:p>
+    <w:p>
+      <w:pPr>
+        <w:spacing w:before="0" w:after="0"/>
+      </w:pPr>
+      <w:r>
+        <w:rPr>
+          <w:rFonts w:ascii="Consolas" w:hAnsi="Consolas" w:cs="Consolas"/>
+          <w:sz w:val="20"/>
+          <w:szCs w:val="20"/>
+        </w:rPr>
+        <w:t xml:space="preserve">  - recall: `0.7806`</w:t>
+      </w:r>
+    </w:p>
+    <w:p>
+      <w:pPr>
+        <w:spacing w:before="0" w:after="0"/>
+      </w:pPr>
+      <w:r>
+        <w:rPr>
+          <w:rFonts w:ascii="Consolas" w:hAnsi="Consolas" w:cs="Consolas"/>
+          <w:sz w:val="20"/>
+          <w:szCs w:val="20"/>
+        </w:rPr>
+        <w:t xml:space="preserve">  - f1: `0.0217`</w:t>
+      </w:r>
+    </w:p>
+    <w:p>
+      <w:pPr>
+        <w:spacing w:before="0" w:after="0"/>
+      </w:pPr>
+      <w:r>
+        <w:rPr>
+          <w:rFonts w:ascii="Consolas" w:hAnsi="Consolas" w:cs="Consolas"/>
+          <w:sz w:val="20"/>
+          <w:szCs w:val="20"/>
+        </w:rPr>
+        <w:t xml:space="preserve">  - auc: `0.6470`</w:t>
+      </w:r>
+    </w:p>
+    <w:p>
+      <w:pPr>
+        <w:spacing w:before="0" w:after="0"/>
+      </w:pPr>
+      <w:r>
+        <w:rPr>
+          <w:rFonts w:ascii="Consolas" w:hAnsi="Consolas" w:cs="Consolas"/>
+          <w:sz w:val="20"/>
+          <w:szCs w:val="20"/>
+        </w:rPr>
+        <w:t xml:space="preserve">- Ensemble:</w:t>
+      </w:r>
+    </w:p>
+    <w:p>
+      <w:pPr>
+        <w:spacing w:before="0" w:after="0"/>
+      </w:pPr>
+      <w:r>
+        <w:rPr>
+          <w:rFonts w:ascii="Consolas" w:hAnsi="Consolas" w:cs="Consolas"/>
+          <w:sz w:val="20"/>
+          <w:szCs w:val="20"/>
+        </w:rPr>
+        <w:t xml:space="preserve">  - accuracy: `0.9838`</w:t>
+      </w:r>
+    </w:p>
+    <w:p>
+      <w:pPr>
+        <w:spacing w:before="0" w:after="0"/>
+      </w:pPr>
+      <w:r>
+        <w:rPr>
+          <w:rFonts w:ascii="Consolas" w:hAnsi="Consolas" w:cs="Consolas"/>
+          <w:sz w:val="20"/>
+          <w:szCs w:val="20"/>
+        </w:rPr>
+        <w:t xml:space="preserve">  - precision: `0.1909`</w:t>
+      </w:r>
+    </w:p>
+    <w:p>
+      <w:pPr>
+        <w:spacing w:before="0" w:after="0"/>
+      </w:pPr>
+      <w:r>
+        <w:rPr>
+          <w:rFonts w:ascii="Consolas" w:hAnsi="Consolas" w:cs="Consolas"/>
+          <w:sz w:val="20"/>
+          <w:szCs w:val="20"/>
+        </w:rPr>
+        <w:t xml:space="preserve">  - recall: `0.4477`</w:t>
+      </w:r>
+    </w:p>
+    <w:p>
+      <w:pPr>
+        <w:spacing w:before="0" w:after="0"/>
+      </w:pPr>
+      <w:r>
+        <w:rPr>
+          <w:rFonts w:ascii="Consolas" w:hAnsi="Consolas" w:cs="Consolas"/>
+          <w:sz w:val="20"/>
+          <w:szCs w:val="20"/>
+        </w:rPr>
+        <w:t xml:space="preserve">  - f1: `0.2676`</w:t>
+      </w:r>
+    </w:p>
+    <w:p>
+      <w:pPr>
+        <w:spacing w:before="0" w:after="0"/>
+      </w:pPr>
+      <w:r>
+        <w:rPr>
+          <w:rFonts w:ascii="Consolas" w:hAnsi="Consolas" w:cs="Consolas"/>
+          <w:sz w:val="20"/>
+          <w:szCs w:val="20"/>
+        </w:rPr>
+        <w:t xml:space="preserve">  - auc: `0.9551`</w:t>
+      </w:r>
+    </w:p>
+    <w:p>
+      <w:pPr>
+        <w:spacing w:before="0" w:after="0"/>
+      </w:pPr>
+      <w:r>
+        <w:rPr>
+          <w:rFonts w:ascii="Consolas" w:hAnsi="Consolas" w:cs="Consolas"/>
+          <w:sz w:val="20"/>
+          <w:szCs w:val="20"/>
+        </w:rPr>
+        <w:t xml:space="preserve">  - pr_auc: `0.1536`</w:t>
+      </w:r>
+    </w:p>
+    <w:p>
+      <w:pPr>
+        <w:spacing w:before="0" w:after="0"/>
+      </w:pPr>
+      <w:r>
+        <w:rPr>
+          <w:rFonts w:ascii="Consolas" w:hAnsi="Consolas" w:cs="Consolas"/>
+          <w:sz w:val="20"/>
+          <w:szCs w:val="20"/>
+        </w:rPr>
+        <w:t xml:space="preserve"/>
+      </w:r>
+    </w:p>
+    <w:p>
+      <w:pPr>
+        <w:spacing w:before="0" w:after="0"/>
+      </w:pPr>
+      <w:r>
+        <w:rPr>
+          <w:rFonts w:ascii="Consolas" w:hAnsi="Consolas" w:cs="Consolas"/>
+          <w:sz w:val="20"/>
+          <w:szCs w:val="20"/>
+        </w:rPr>
+        <w:t xml:space="preserve">Tuned ensemble weights: ANN `0.60`, LightGBM `0.40`, GNN `0.00`. The threshold-tuning search assigned GNN zero weight in this particular run — its standalone precision (`0.0110`) was too low relative to the `min_precision=0.08` floor to earn a share of the vote, so this tuned ensemble is effectively ANN + LightGBM here, even though all three models are trained and available. GNN's presence in the architecture is still real (and its weight is not fixed at zero — it is re-searched on every training run), but this snapshot illustrates a known limitation: GNN remains the weakest leg (see section 15).</w:t>
+      </w:r>
+    </w:p>
+    <w:p>
+      <w:pPr>
+        <w:spacing w:before="0" w:after="0"/>
+      </w:pPr>
+      <w:r>
+        <w:rPr>
+          <w:rFonts w:ascii="Consolas" w:hAnsi="Consolas" w:cs="Consolas"/>
+          <w:sz w:val="20"/>
+          <w:szCs w:val="20"/>
+        </w:rPr>
+        <w:t xml:space="preserve"/>
+      </w:r>
+    </w:p>
+    <w:p>
+      <w:pPr>
+        <w:spacing w:before="0" w:after="0"/>
+      </w:pPr>
+      <w:r>
+        <w:rPr>
+          <w:rFonts w:ascii="Consolas" w:hAnsi="Consolas" w:cs="Consolas"/>
+          <w:sz w:val="20"/>
+          <w:szCs w:val="20"/>
+        </w:rPr>
+        <w:t xml:space="preserve">Before/after comparison against section 10.5 (ANN + GNN only, before LightGBM was added):</w:t>
+      </w:r>
+    </w:p>
+    <w:p>
+      <w:pPr>
+        <w:spacing w:before="0" w:after="0"/>
+      </w:pPr>
+      <w:r>
+        <w:rPr>
+          <w:rFonts w:ascii="Consolas" w:hAnsi="Consolas" w:cs="Consolas"/>
+          <w:sz w:val="20"/>
+          <w:szCs w:val="20"/>
+        </w:rPr>
+        <w:t xml:space="preserve"/>
+      </w:r>
+    </w:p>
+    <w:p>
+      <w:pPr>
+        <w:spacing w:before="0" w:after="0"/>
+      </w:pPr>
+      <w:r>
+        <w:rPr>
+          <w:rFonts w:ascii="Consolas" w:hAnsi="Consolas" w:cs="Consolas"/>
+          <w:sz w:val="20"/>
+          <w:szCs w:val="20"/>
+        </w:rPr>
+        <w:t xml:space="preserve">| Metric | Before (ANN + GNN) | After (ANN + LightGBM + GNN) |</w:t>
+      </w:r>
+    </w:p>
+    <w:p>
+      <w:pPr>
+        <w:spacing w:before="0" w:after="0"/>
+      </w:pPr>
+      <w:r>
+        <w:rPr>
+          <w:rFonts w:ascii="Consolas" w:hAnsi="Consolas" w:cs="Consolas"/>
+          <w:sz w:val="20"/>
+          <w:szCs w:val="20"/>
+        </w:rPr>
+        <w:t xml:space="preserve">|---|---|---|</w:t>
+      </w:r>
+    </w:p>
+    <w:p>
+      <w:pPr>
+        <w:spacing w:before="0" w:after="0"/>
+      </w:pPr>
+      <w:r>
+        <w:rPr>
+          <w:rFonts w:ascii="Consolas" w:hAnsi="Consolas" w:cs="Consolas"/>
+          <w:sz w:val="20"/>
+          <w:szCs w:val="20"/>
+        </w:rPr>
+        <w:t xml:space="preserve">| Precision | `0.0558` | `0.1909` (+3.4x) |</w:t>
+      </w:r>
+    </w:p>
+    <w:p>
+      <w:pPr>
+        <w:spacing w:before="0" w:after="0"/>
+      </w:pPr>
+      <w:r>
+        <w:rPr>
+          <w:rFonts w:ascii="Consolas" w:hAnsi="Consolas" w:cs="Consolas"/>
+          <w:sz w:val="20"/>
+          <w:szCs w:val="20"/>
+        </w:rPr>
+        <w:t xml:space="preserve">| F1 | `0.1025` | `0.2676` (+2.6x) |</w:t>
+      </w:r>
+    </w:p>
+    <w:p>
+      <w:pPr>
+        <w:spacing w:before="0" w:after="0"/>
+      </w:pPr>
+      <w:r>
+        <w:rPr>
+          <w:rFonts w:ascii="Consolas" w:hAnsi="Consolas" w:cs="Consolas"/>
+          <w:sz w:val="20"/>
+          <w:szCs w:val="20"/>
+        </w:rPr>
+        <w:t xml:space="preserve">| PR-AUC | `0.0512` | `0.1536` (+3.0x) |</w:t>
+      </w:r>
+    </w:p>
+    <w:p>
+      <w:pPr>
+        <w:spacing w:before="0" w:after="0"/>
+      </w:pPr>
+      <w:r>
+        <w:rPr>
+          <w:rFonts w:ascii="Consolas" w:hAnsi="Consolas" w:cs="Consolas"/>
+          <w:sz w:val="20"/>
+          <w:szCs w:val="20"/>
+        </w:rPr>
+        <w:t xml:space="preserve">| Recall | `0.6246` | `0.4477` (tradeoff) |</w:t>
+      </w:r>
+    </w:p>
+    <w:p>
+      <w:pPr>
+        <w:spacing w:before="0" w:after="0"/>
+      </w:pPr>
+      <w:r>
+        <w:rPr>
+          <w:rFonts w:ascii="Consolas" w:hAnsi="Consolas" w:cs="Consolas"/>
+          <w:sz w:val="20"/>
+          <w:szCs w:val="20"/>
+        </w:rPr>
+        <w:t xml:space="preserve">| AUC | `0.9277` | `0.9551` |</w:t>
+      </w:r>
+    </w:p>
+    <w:p>
+      <w:pPr>
+        <w:spacing w:before="0" w:after="0"/>
+      </w:pPr>
+      <w:r>
+        <w:rPr>
+          <w:rFonts w:ascii="Consolas" w:hAnsi="Consolas" w:cs="Consolas"/>
+          <w:sz w:val="20"/>
+          <w:szCs w:val="20"/>
+        </w:rPr>
+        <w:t xml:space="preserve"/>
+      </w:r>
+    </w:p>
+    <w:p>
+      <w:pPr>
+        <w:spacing w:before="0" w:after="0"/>
+      </w:pPr>
+      <w:r>
+        <w:rPr>
+          <w:rFonts w:ascii="Consolas" w:hAnsi="Consolas" w:cs="Consolas"/>
+          <w:sz w:val="20"/>
+          <w:szCs w:val="20"/>
+        </w:rPr>
+        <w:t xml:space="preserve">Interpretation:</w:t>
+      </w:r>
+    </w:p>
+    <w:p>
+      <w:pPr>
+        <w:spacing w:before="0" w:after="0"/>
+      </w:pPr>
+      <w:r>
+        <w:rPr>
+          <w:rFonts w:ascii="Consolas" w:hAnsi="Consolas" w:cs="Consolas"/>
+          <w:sz w:val="20"/>
+          <w:szCs w:val="20"/>
+        </w:rPr>
+        <w:t xml:space="preserve"/>
+      </w:r>
+    </w:p>
+    <w:p>
+      <w:pPr>
+        <w:spacing w:before="0" w:after="0"/>
+      </w:pPr>
+      <w:r>
+        <w:rPr>
+          <w:rFonts w:ascii="Consolas" w:hAnsi="Consolas" w:cs="Consolas"/>
+          <w:sz w:val="20"/>
+          <w:szCs w:val="20"/>
+        </w:rPr>
+        <w:t xml:space="preserve">- adding LightGBM substantially improved precision, F1, and PR-AUC — the metrics that matter most for AML alert quality</w:t>
+      </w:r>
+    </w:p>
+    <w:p>
+      <w:pPr>
+        <w:spacing w:before="0" w:after="0"/>
+      </w:pPr>
+      <w:r>
+        <w:rPr>
+          <w:rFonts w:ascii="Consolas" w:hAnsi="Consolas" w:cs="Consolas"/>
+          <w:sz w:val="20"/>
+          <w:szCs w:val="20"/>
+        </w:rPr>
+        <w:t xml:space="preserve">- recall dropped as a tradeoff, consistent with the tighter, more selective threshold the tuner chose to hit the precision floor</w:t>
+      </w:r>
+    </w:p>
+    <w:p>
+      <w:pPr>
+        <w:spacing w:before="0" w:after="0"/>
+      </w:pPr>
+      <w:r>
+        <w:rPr>
+          <w:rFonts w:ascii="Consolas" w:hAnsi="Consolas" w:cs="Consolas"/>
+          <w:sz w:val="20"/>
+          <w:szCs w:val="20"/>
+        </w:rPr>
+        <w:t xml:space="preserve">- this is the version to present: same ANN + GNN architecture as before, with LightGBM added as a documented enhancement</w:t>
+      </w:r>
+    </w:p>
+    <w:p>
+      <w:pPr>
+        <w:spacing w:before="0" w:after="0"/>
+      </w:pPr>
+      <w:r>
+        <w:rPr>
+          <w:rFonts w:ascii="Consolas" w:hAnsi="Consolas" w:cs="Consolas"/>
+          <w:sz w:val="20"/>
+          <w:szCs w:val="20"/>
+        </w:rPr>
+        <w:t xml:space="preserve"/>
+      </w:r>
+    </w:p>
+    <w:p>
+      <w:pPr>
+        <w:spacing w:before="0" w:after="0"/>
+      </w:pPr>
+      <w:r>
+        <w:rPr>
+          <w:rFonts w:ascii="Consolas" w:hAnsi="Consolas" w:cs="Consolas"/>
+          <w:sz w:val="20"/>
+          <w:szCs w:val="20"/>
+        </w:rPr>
         <w:t xml:space="preserve">---</w:t>
       </w:r>
     </w:p>
@@ -18077,7 +19434,7 @@
           <w:sz w:val="20"/>
           <w:szCs w:val="20"/>
         </w:rPr>
-        <w:t xml:space="preserve">3. Show ANN + GNN + ensemble architecture</w:t>
+        <w:t xml:space="preserve">3. Show ANN + LightGBM + GNN + ensemble architecture</w:t>
       </w:r>
     </w:p>
     <w:p>
@@ -18714,7 +20071,7 @@
           <w:sz w:val="20"/>
           <w:szCs w:val="20"/>
         </w:rPr>
-        <w:t xml:space="preserve">&amp; "C:\Program Files\PostgreSQL\18\pgAdmin 4\python\python.exe" -m pip install numpy pandas scikit-learn matplotlib torch streamlit</w:t>
+        <w:t xml:space="preserve">&amp; "C:\Program Files\PostgreSQL\18\pgAdmin 4\python\python.exe" -m pip install numpy pandas scikit-learn matplotlib torch lightgbm streamlit</w:t>
       </w:r>
     </w:p>
     <w:p>
@@ -18909,7 +20266,7 @@
           <w:sz w:val="20"/>
           <w:szCs w:val="20"/>
         </w:rPr>
-        <w:t xml:space="preserve">&amp; "C:\Program Files\PostgreSQL\18\pgAdmin 4\python\python.exe" -c "import sys; sys.path.insert(0, r'c:\Users\pc\VS Code\Project'); import main; sys.argv=['main.py','train','--data','datasets/HI-Small_Trans_train_ratio_1_10_augmented.csv','--eval-data','datasets/HI-Small_Trans_parent_1_150.csv','--outputs','outputs/run_parent_1_150_tuned','--models','models/run_parent_1_150_tuned','--epochs-ann','6','--epochs-gnn','6','--min-precision','0.08']; main.main()"</w:t>
+        <w:t xml:space="preserve">&amp; "C:\Program Files\PostgreSQL\18\pgAdmin 4\python\python.exe" -c "import sys; sys.path.insert(0, r'c:\Users\pc\VS Code\Project'); import main; sys.argv=['main.py','train','--data','datasets/HI-Small_Trans_train_ratio_1_10_augmented.csv','--eval-data','datasets/HI-Small_Trans_parent_1_150.csv','--outputs','outputs/run_parent_1_150_tuned','--models','models/run_parent_1_150_tuned','--epochs-ann','6','--lgbm-rounds','400','--epochs-gnn','6','--min-precision','0.08']; main.main()"</w:t>
       </w:r>
     </w:p>
     <w:p>
@@ -19026,6 +20383,19 @@
           <w:sz w:val="20"/>
           <w:szCs w:val="20"/>
         </w:rPr>
+        <w:t xml:space="preserve">- LightGBM: gradient-boosted decision tree ensemble (second tabular model, added alongside the ANN)</w:t>
+      </w:r>
+    </w:p>
+    <w:p>
+      <w:pPr>
+        <w:spacing w:before="0" w:after="0"/>
+      </w:pPr>
+      <w:r>
+        <w:rPr>
+          <w:rFonts w:ascii="Consolas" w:hAnsi="Consolas" w:cs="Consolas"/>
+          <w:sz w:val="20"/>
+          <w:szCs w:val="20"/>
+        </w:rPr>
         <w:t xml:space="preserve">- GNN: Graph Neural Network</w:t>
       </w:r>
     </w:p>
@@ -19247,7 +20617,7 @@
           <w:sz w:val="20"/>
           <w:szCs w:val="20"/>
         </w:rPr>
-        <w:t xml:space="preserve">- GNN remains weaker than ANN in several runs</w:t>
+        <w:t xml:space="preserve">- GNN remains weaker than the tabular models (ANN, LightGBM) in several runs</w:t>
       </w:r>
     </w:p>
     <w:p>
@@ -19533,7 +20903,7 @@
           <w:sz w:val="20"/>
           <w:szCs w:val="20"/>
         </w:rPr>
-        <w:t xml:space="preserve">- ANN + GNN + ensemble architecture</w:t>
+        <w:t xml:space="preserve">- ANN + LightGBM + GNN + ensemble architecture</w:t>
       </w:r>
     </w:p>
     <w:p>
@@ -19897,6 +21267,19 @@
           <w:sz w:val="20"/>
           <w:szCs w:val="20"/>
         </w:rPr>
+        <w:t xml:space="preserve">    train_parser.add_argument("--lgbm-rounds", type=int, default=400, help="LightGBM boosting rounds")</w:t>
+      </w:r>
+    </w:p>
+    <w:p>
+      <w:pPr>
+        <w:spacing w:before="0" w:after="0"/>
+      </w:pPr>
+      <w:r>
+        <w:rPr>
+          <w:rFonts w:ascii="Consolas" w:hAnsi="Consolas" w:cs="Consolas"/>
+          <w:sz w:val="20"/>
+          <w:szCs w:val="20"/>
+        </w:rPr>
         <w:t xml:space="preserve">    train_parser.add_argument("--epochs-gnn", type=int, default=8, help="GNN epochs")</w:t>
       </w:r>
     </w:p>
@@ -20131,6 +21514,19 @@
           <w:sz w:val="20"/>
           <w:szCs w:val="20"/>
         </w:rPr>
+        <w:t xml:space="preserve">            lgbm_rounds=args.lgbm_rounds,</w:t>
+      </w:r>
+    </w:p>
+    <w:p>
+      <w:pPr>
+        <w:spacing w:before="0" w:after="0"/>
+      </w:pPr>
+      <w:r>
+        <w:rPr>
+          <w:rFonts w:ascii="Consolas" w:hAnsi="Consolas" w:cs="Consolas"/>
+          <w:sz w:val="20"/>
+          <w:szCs w:val="20"/>
+        </w:rPr>
         <w:t xml:space="preserve">            epochs_gnn=args.epochs_gnn,</w:t>
       </w:r>
     </w:p>
@@ -20690,7 +22086,7 @@
           <w:sz w:val="20"/>
           <w:szCs w:val="20"/>
         </w:rPr>
-        <w:t xml:space="preserve">AML (Anti-Money Laundering) transaction detection system that combines an ANN, a GNN, and a soft-voting ensemble to flag suspicious transactions in highly imbalanced financial data, with a Streamlit demo UI for live predictions and evaluation.</w:t>
+        <w:t xml:space="preserve">AML (Anti-Money Laundering) transaction detection system that combines an ANN, LightGBM, a GNN, and a soft-voting ensemble to flag suspicious transactions in highly imbalanced financial data, with a Streamlit demo UI for live predictions and evaluation.</w:t>
       </w:r>
     </w:p>
     <w:p>
@@ -20742,7 +22138,20 @@
           <w:sz w:val="20"/>
           <w:szCs w:val="20"/>
         </w:rPr>
-        <w:t xml:space="preserve">- **ANN** — learns tabular transaction behavior patterns</w:t>
+        <w:t xml:space="preserve">- **ANN** — learns tabular transaction behavior patterns (feed-forward network)</w:t>
+      </w:r>
+    </w:p>
+    <w:p>
+      <w:pPr>
+        <w:spacing w:before="0" w:after="0"/>
+      </w:pPr>
+      <w:r>
+        <w:rPr>
+          <w:rFonts w:ascii="Consolas" w:hAnsi="Consolas" w:cs="Consolas"/>
+          <w:sz w:val="20"/>
+          <w:szCs w:val="20"/>
+        </w:rPr>
+        <w:t xml:space="preserve">- **LightGBM** — learns tabular transaction behavior patterns (gradient-boosted trees, added alongside the ANN to improve precision)</w:t>
       </w:r>
     </w:p>
     <w:p>
@@ -20768,7 +22177,7 @@
           <w:sz w:val="20"/>
           <w:szCs w:val="20"/>
         </w:rPr>
-        <w:t xml:space="preserve">- **Ensemble** — soft voting over ANN/GNN probabilities with a tuned decision threshold</w:t>
+        <w:t xml:space="preserve">- **Ensemble** — soft voting over ANN/LightGBM/GNN probabilities with a tuned decision threshold</w:t>
       </w:r>
     </w:p>
     <w:p>
@@ -20963,20 +22372,33 @@
           <w:sz w:val="20"/>
           <w:szCs w:val="20"/>
         </w:rPr>
-        <w:t xml:space="preserve">  gnn.py                 GNN architecture</w:t>
-      </w:r>
-    </w:p>
-    <w:p>
-      <w:pPr>
-        <w:spacing w:before="0" w:after="0"/>
-      </w:pPr>
-      <w:r>
-        <w:rPr>
-          <w:rFonts w:ascii="Consolas" w:hAnsi="Consolas" w:cs="Consolas"/>
-          <w:sz w:val="20"/>
-          <w:szCs w:val="20"/>
-        </w:rPr>
-        <w:t xml:space="preserve">  ensemble.py             soft voting ensemble + probability transform logic</w:t>
+        <w:t xml:space="preserve">  lgbm_model.py           LightGBM model config</w:t>
+      </w:r>
+    </w:p>
+    <w:p>
+      <w:pPr>
+        <w:spacing w:before="0" w:after="0"/>
+      </w:pPr>
+      <w:r>
+        <w:rPr>
+          <w:rFonts w:ascii="Consolas" w:hAnsi="Consolas" w:cs="Consolas"/>
+          <w:sz w:val="20"/>
+          <w:szCs w:val="20"/>
+        </w:rPr>
+        <w:t xml:space="preserve">  gnn.py                   GNN architecture</w:t>
+      </w:r>
+    </w:p>
+    <w:p>
+      <w:pPr>
+        <w:spacing w:before="0" w:after="0"/>
+      </w:pPr>
+      <w:r>
+        <w:rPr>
+          <w:rFonts w:ascii="Consolas" w:hAnsi="Consolas" w:cs="Consolas"/>
+          <w:sz w:val="20"/>
+          <w:szCs w:val="20"/>
+        </w:rPr>
+        <w:t xml:space="preserve">  ensemble.py               3-way soft voting ensemble + probability transform logic</w:t>
       </w:r>
     </w:p>
     <w:p>
@@ -21197,7 +22619,7 @@
           <w:sz w:val="20"/>
           <w:szCs w:val="20"/>
         </w:rPr>
-        <w:t xml:space="preserve">pip install numpy pandas scikit-learn matplotlib torch streamlit</w:t>
+        <w:t xml:space="preserve">pip install numpy pandas scikit-learn matplotlib torch lightgbm streamlit</w:t>
       </w:r>
     </w:p>
     <w:p>
@@ -21379,7 +22801,7 @@
           <w:sz w:val="20"/>
           <w:szCs w:val="20"/>
         </w:rPr>
-        <w:t xml:space="preserve">python main.py train --data datasets/HI-Small_Trans_train_ratio_1_10_augmented.csv --eval-data datasets/HI-Small_Trans_parent_1_150.csv --outputs outputs/run_parent_1_150_tuned --models models/run_parent_1_150_tuned --epochs-ann 6 --epochs-gnn 6 --min-precision 0.08</w:t>
+        <w:t xml:space="preserve">python main.py train --data datasets/HI-Small_Trans_train_ratio_1_10_augmented.csv --eval-data datasets/HI-Small_Trans_parent_1_150.csv --outputs outputs/run_parent_1_150_tuned --models models/run_parent_1_150_tuned --epochs-ann 6 --lgbm-rounds 400 --epochs-gnn 6 --min-precision 0.08</w:t>
       </w:r>
     </w:p>
     <w:p>
@@ -25526,6 +26948,19 @@
           <w:sz w:val="20"/>
           <w:szCs w:val="20"/>
         </w:rPr>
+        <w:t xml:space="preserve">    lgbm_weight: float</w:t>
+      </w:r>
+    </w:p>
+    <w:p>
+      <w:pPr>
+        <w:spacing w:before="0" w:after="0"/>
+      </w:pPr>
+      <w:r>
+        <w:rPr>
+          <w:rFonts w:ascii="Consolas" w:hAnsi="Consolas" w:cs="Consolas"/>
+          <w:sz w:val="20"/>
+          <w:szCs w:val="20"/>
+        </w:rPr>
         <w:t xml:space="preserve">    gnn_weight: float</w:t>
       </w:r>
     </w:p>
@@ -25565,6 +27000,19 @@
           <w:sz w:val="20"/>
           <w:szCs w:val="20"/>
         </w:rPr>
+        <w:t xml:space="preserve">    lgbm_transform: ProbabilityTransform</w:t>
+      </w:r>
+    </w:p>
+    <w:p>
+      <w:pPr>
+        <w:spacing w:before="0" w:after="0"/>
+      </w:pPr>
+      <w:r>
+        <w:rPr>
+          <w:rFonts w:ascii="Consolas" w:hAnsi="Consolas" w:cs="Consolas"/>
+          <w:sz w:val="20"/>
+          <w:szCs w:val="20"/>
+        </w:rPr>
         <w:t xml:space="preserve">    gnn_transform: ProbabilityTransform</w:t>
       </w:r>
     </w:p>
@@ -25656,20 +27104,20 @@
           <w:sz w:val="20"/>
           <w:szCs w:val="20"/>
         </w:rPr>
-        <w:t xml:space="preserve">def _voting_probs(ann_probs, gnn_probs, ann_weight, gnn_weight):</w:t>
-      </w:r>
-    </w:p>
-    <w:p>
-      <w:pPr>
-        <w:spacing w:before="0" w:after="0"/>
-      </w:pPr>
-      <w:r>
-        <w:rPr>
-          <w:rFonts w:ascii="Consolas" w:hAnsi="Consolas" w:cs="Consolas"/>
-          <w:sz w:val="20"/>
-          <w:szCs w:val="20"/>
-        </w:rPr>
-        <w:t xml:space="preserve">    total = ann_weight + gnn_weight</w:t>
+        <w:t xml:space="preserve">def _voting_probs(ann_probs, lgbm_probs, gnn_probs, ann_weight, lgbm_weight, gnn_weight):</w:t>
+      </w:r>
+    </w:p>
+    <w:p>
+      <w:pPr>
+        <w:spacing w:before="0" w:after="0"/>
+      </w:pPr>
+      <w:r>
+        <w:rPr>
+          <w:rFonts w:ascii="Consolas" w:hAnsi="Consolas" w:cs="Consolas"/>
+          <w:sz w:val="20"/>
+          <w:szCs w:val="20"/>
+        </w:rPr>
+        <w:t xml:space="preserve">    total = ann_weight + lgbm_weight + gnn_weight</w:t>
       </w:r>
     </w:p>
     <w:p>
@@ -25695,20 +27143,20 @@
           <w:sz w:val="20"/>
           <w:szCs w:val="20"/>
         </w:rPr>
-        <w:t xml:space="preserve">        ann_weight, gnn_weight, total = 0.5, 0.5, 1.0</w:t>
-      </w:r>
-    </w:p>
-    <w:p>
-      <w:pPr>
-        <w:spacing w:before="0" w:after="0"/>
-      </w:pPr>
-      <w:r>
-        <w:rPr>
-          <w:rFonts w:ascii="Consolas" w:hAnsi="Consolas" w:cs="Consolas"/>
-          <w:sz w:val="20"/>
-          <w:szCs w:val="20"/>
-        </w:rPr>
-        <w:t xml:space="preserve">    return (ann_weight * ann_probs + gnn_weight * gnn_probs) / total</w:t>
+        <w:t xml:space="preserve">        ann_weight, lgbm_weight, gnn_weight, total = 1.0, 1.0, 1.0, 3.0</w:t>
+      </w:r>
+    </w:p>
+    <w:p>
+      <w:pPr>
+        <w:spacing w:before="0" w:after="0"/>
+      </w:pPr>
+      <w:r>
+        <w:rPr>
+          <w:rFonts w:ascii="Consolas" w:hAnsi="Consolas" w:cs="Consolas"/>
+          <w:sz w:val="20"/>
+          <w:szCs w:val="20"/>
+        </w:rPr>
+        <w:t xml:space="preserve">    return (ann_weight * ann_probs + lgbm_weight * lgbm_probs + gnn_weight * gnn_probs) / total</w:t>
       </w:r>
     </w:p>
     <w:p>
@@ -26111,7 +27559,176 @@
           <w:sz w:val="20"/>
           <w:szCs w:val="20"/>
         </w:rPr>
-        <w:t xml:space="preserve">def train_meta_model(ann_probs, gnn_probs, y, min_precision=0.15):</w:t>
+        <w:t xml:space="preserve">def _simplex_weight_grid(step=0.1):</w:t>
+      </w:r>
+    </w:p>
+    <w:p>
+      <w:pPr>
+        <w:spacing w:before="0" w:after="0"/>
+      </w:pPr>
+      <w:r>
+        <w:rPr>
+          <w:rFonts w:ascii="Consolas" w:hAnsi="Consolas" w:cs="Consolas"/>
+          <w:sz w:val="20"/>
+          <w:szCs w:val="20"/>
+        </w:rPr>
+        <w:t xml:space="preserve">    # All (a, b, c) with a, b, c on a `step` grid and a + b + c == 1.</w:t>
+      </w:r>
+    </w:p>
+    <w:p>
+      <w:pPr>
+        <w:spacing w:before="0" w:after="0"/>
+      </w:pPr>
+      <w:r>
+        <w:rPr>
+          <w:rFonts w:ascii="Consolas" w:hAnsi="Consolas" w:cs="Consolas"/>
+          <w:sz w:val="20"/>
+          <w:szCs w:val="20"/>
+        </w:rPr>
+        <w:t xml:space="preserve">    steps = np.round(np.arange(0.0, 1.0 + 1e-9, step), 2)</w:t>
+      </w:r>
+    </w:p>
+    <w:p>
+      <w:pPr>
+        <w:spacing w:before="0" w:after="0"/>
+      </w:pPr>
+      <w:r>
+        <w:rPr>
+          <w:rFonts w:ascii="Consolas" w:hAnsi="Consolas" w:cs="Consolas"/>
+          <w:sz w:val="20"/>
+          <w:szCs w:val="20"/>
+        </w:rPr>
+        <w:t xml:space="preserve">    grid = []</w:t>
+      </w:r>
+    </w:p>
+    <w:p>
+      <w:pPr>
+        <w:spacing w:before="0" w:after="0"/>
+      </w:pPr>
+      <w:r>
+        <w:rPr>
+          <w:rFonts w:ascii="Consolas" w:hAnsi="Consolas" w:cs="Consolas"/>
+          <w:sz w:val="20"/>
+          <w:szCs w:val="20"/>
+        </w:rPr>
+        <w:t xml:space="preserve">    for a in steps:</w:t>
+      </w:r>
+    </w:p>
+    <w:p>
+      <w:pPr>
+        <w:spacing w:before="0" w:after="0"/>
+      </w:pPr>
+      <w:r>
+        <w:rPr>
+          <w:rFonts w:ascii="Consolas" w:hAnsi="Consolas" w:cs="Consolas"/>
+          <w:sz w:val="20"/>
+          <w:szCs w:val="20"/>
+        </w:rPr>
+        <w:t xml:space="preserve">        for b in steps:</w:t>
+      </w:r>
+    </w:p>
+    <w:p>
+      <w:pPr>
+        <w:spacing w:before="0" w:after="0"/>
+      </w:pPr>
+      <w:r>
+        <w:rPr>
+          <w:rFonts w:ascii="Consolas" w:hAnsi="Consolas" w:cs="Consolas"/>
+          <w:sz w:val="20"/>
+          <w:szCs w:val="20"/>
+        </w:rPr>
+        <w:t xml:space="preserve">            c = round(1.0 - a - b, 2)</w:t>
+      </w:r>
+    </w:p>
+    <w:p>
+      <w:pPr>
+        <w:spacing w:before="0" w:after="0"/>
+      </w:pPr>
+      <w:r>
+        <w:rPr>
+          <w:rFonts w:ascii="Consolas" w:hAnsi="Consolas" w:cs="Consolas"/>
+          <w:sz w:val="20"/>
+          <w:szCs w:val="20"/>
+        </w:rPr>
+        <w:t xml:space="preserve">            if c &lt; -1e-9 or c &gt; 1.0 + 1e-9:</w:t>
+      </w:r>
+    </w:p>
+    <w:p>
+      <w:pPr>
+        <w:spacing w:before="0" w:after="0"/>
+      </w:pPr>
+      <w:r>
+        <w:rPr>
+          <w:rFonts w:ascii="Consolas" w:hAnsi="Consolas" w:cs="Consolas"/>
+          <w:sz w:val="20"/>
+          <w:szCs w:val="20"/>
+        </w:rPr>
+        <w:t xml:space="preserve">                continue</w:t>
+      </w:r>
+    </w:p>
+    <w:p>
+      <w:pPr>
+        <w:spacing w:before="0" w:after="0"/>
+      </w:pPr>
+      <w:r>
+        <w:rPr>
+          <w:rFonts w:ascii="Consolas" w:hAnsi="Consolas" w:cs="Consolas"/>
+          <w:sz w:val="20"/>
+          <w:szCs w:val="20"/>
+        </w:rPr>
+        <w:t xml:space="preserve">            grid.append((float(a), float(b), float(max(c, 0.0))))</w:t>
+      </w:r>
+    </w:p>
+    <w:p>
+      <w:pPr>
+        <w:spacing w:before="0" w:after="0"/>
+      </w:pPr>
+      <w:r>
+        <w:rPr>
+          <w:rFonts w:ascii="Consolas" w:hAnsi="Consolas" w:cs="Consolas"/>
+          <w:sz w:val="20"/>
+          <w:szCs w:val="20"/>
+        </w:rPr>
+        <w:t xml:space="preserve">    return grid</w:t>
+      </w:r>
+    </w:p>
+    <w:p>
+      <w:pPr>
+        <w:spacing w:before="0" w:after="0"/>
+      </w:pPr>
+      <w:r>
+        <w:rPr>
+          <w:rFonts w:ascii="Consolas" w:hAnsi="Consolas" w:cs="Consolas"/>
+          <w:sz w:val="20"/>
+          <w:szCs w:val="20"/>
+        </w:rPr>
+        <w:t xml:space="preserve"/>
+      </w:r>
+    </w:p>
+    <w:p>
+      <w:pPr>
+        <w:spacing w:before="0" w:after="0"/>
+      </w:pPr>
+      <w:r>
+        <w:rPr>
+          <w:rFonts w:ascii="Consolas" w:hAnsi="Consolas" w:cs="Consolas"/>
+          <w:sz w:val="20"/>
+          <w:szCs w:val="20"/>
+        </w:rPr>
+        <w:t xml:space="preserve"/>
+      </w:r>
+    </w:p>
+    <w:p>
+      <w:pPr>
+        <w:spacing w:before="0" w:after="0"/>
+      </w:pPr>
+      <w:r>
+        <w:rPr>
+          <w:rFonts w:ascii="Consolas" w:hAnsi="Consolas" w:cs="Consolas"/>
+          <w:sz w:val="20"/>
+          <w:szCs w:val="20"/>
+        </w:rPr>
+        <w:t xml:space="preserve">def train_meta_model(ann_probs, lgbm_probs, gnn_probs, y, min_precision=0.15):</w:t>
       </w:r>
     </w:p>
     <w:p>
@@ -26137,6 +27754,19 @@
           <w:sz w:val="20"/>
           <w:szCs w:val="20"/>
         </w:rPr>
+        <w:t xml:space="preserve">    lgbm_probs = _to_1d(lgbm_probs)</w:t>
+      </w:r>
+    </w:p>
+    <w:p>
+      <w:pPr>
+        <w:spacing w:before="0" w:after="0"/>
+      </w:pPr>
+      <w:r>
+        <w:rPr>
+          <w:rFonts w:ascii="Consolas" w:hAnsi="Consolas" w:cs="Consolas"/>
+          <w:sz w:val="20"/>
+          <w:szCs w:val="20"/>
+        </w:rPr>
         <w:t xml:space="preserve">    gnn_probs = _to_1d(gnn_probs)</w:t>
       </w:r>
     </w:p>
@@ -26189,6 +27819,19 @@
           <w:sz w:val="20"/>
           <w:szCs w:val="20"/>
         </w:rPr>
+        <w:t xml:space="preserve">    lgbm_transform = _fit_probability_transform(lgbm_probs, y)</w:t>
+      </w:r>
+    </w:p>
+    <w:p>
+      <w:pPr>
+        <w:spacing w:before="0" w:after="0"/>
+      </w:pPr>
+      <w:r>
+        <w:rPr>
+          <w:rFonts w:ascii="Consolas" w:hAnsi="Consolas" w:cs="Consolas"/>
+          <w:sz w:val="20"/>
+          <w:szCs w:val="20"/>
+        </w:rPr>
         <w:t xml:space="preserve">    gnn_transform = _fit_probability_transform(gnn_probs, y)</w:t>
       </w:r>
     </w:p>
@@ -26215,6 +27858,19 @@
           <w:sz w:val="20"/>
           <w:szCs w:val="20"/>
         </w:rPr>
+        <w:t xml:space="preserve">    lgbm_probs_cal = _apply_transform(lgbm_transform, lgbm_probs)</w:t>
+      </w:r>
+    </w:p>
+    <w:p>
+      <w:pPr>
+        <w:spacing w:before="0" w:after="0"/>
+      </w:pPr>
+      <w:r>
+        <w:rPr>
+          <w:rFonts w:ascii="Consolas" w:hAnsi="Consolas" w:cs="Consolas"/>
+          <w:sz w:val="20"/>
+          <w:szCs w:val="20"/>
+        </w:rPr>
         <w:t xml:space="preserve">    gnn_probs_cal = _apply_transform(gnn_transform, gnn_probs)</w:t>
       </w:r>
     </w:p>
@@ -26241,7 +27897,7 @@
           <w:sz w:val="20"/>
           <w:szCs w:val="20"/>
         </w:rPr>
-        <w:t xml:space="preserve">    weight_grid = np.linspace(0.0, 1.0, 21)</w:t>
+        <w:t xml:space="preserve">    weight_grid = _simplex_weight_grid(step=0.1)</w:t>
       </w:r>
     </w:p>
     <w:p>
@@ -26345,20 +28001,33 @@
           <w:sz w:val="20"/>
           <w:szCs w:val="20"/>
         </w:rPr>
-        <w:t xml:space="preserve">        ann_weight=0.5,</w:t>
-      </w:r>
-    </w:p>
-    <w:p>
-      <w:pPr>
-        <w:spacing w:before="0" w:after="0"/>
-      </w:pPr>
-      <w:r>
-        <w:rPr>
-          <w:rFonts w:ascii="Consolas" w:hAnsi="Consolas" w:cs="Consolas"/>
-          <w:sz w:val="20"/>
-          <w:szCs w:val="20"/>
-        </w:rPr>
-        <w:t xml:space="preserve">        gnn_weight=0.5,</w:t>
+        <w:t xml:space="preserve">        ann_weight=1 / 3,</w:t>
+      </w:r>
+    </w:p>
+    <w:p>
+      <w:pPr>
+        <w:spacing w:before="0" w:after="0"/>
+      </w:pPr>
+      <w:r>
+        <w:rPr>
+          <w:rFonts w:ascii="Consolas" w:hAnsi="Consolas" w:cs="Consolas"/>
+          <w:sz w:val="20"/>
+          <w:szCs w:val="20"/>
+        </w:rPr>
+        <w:t xml:space="preserve">        lgbm_weight=1 / 3,</w:t>
+      </w:r>
+    </w:p>
+    <w:p>
+      <w:pPr>
+        <w:spacing w:before="0" w:after="0"/>
+      </w:pPr>
+      <w:r>
+        <w:rPr>
+          <w:rFonts w:ascii="Consolas" w:hAnsi="Consolas" w:cs="Consolas"/>
+          <w:sz w:val="20"/>
+          <w:szCs w:val="20"/>
+        </w:rPr>
+        <w:t xml:space="preserve">        gnn_weight=1 / 3,</w:t>
       </w:r>
     </w:p>
     <w:p>
@@ -26397,6 +28066,19 @@
           <w:sz w:val="20"/>
           <w:szCs w:val="20"/>
         </w:rPr>
+        <w:t xml:space="preserve">        lgbm_transform=lgbm_transform,</w:t>
+      </w:r>
+    </w:p>
+    <w:p>
+      <w:pPr>
+        <w:spacing w:before="0" w:after="0"/>
+      </w:pPr>
+      <w:r>
+        <w:rPr>
+          <w:rFonts w:ascii="Consolas" w:hAnsi="Consolas" w:cs="Consolas"/>
+          <w:sz w:val="20"/>
+          <w:szCs w:val="20"/>
+        </w:rPr>
         <w:t xml:space="preserve">        gnn_transform=gnn_transform,</w:t>
       </w:r>
     </w:p>
@@ -26436,33 +28118,20 @@
           <w:sz w:val="20"/>
           <w:szCs w:val="20"/>
         </w:rPr>
-        <w:t xml:space="preserve">    for ann_w in weight_grid:</w:t>
-      </w:r>
-    </w:p>
-    <w:p>
-      <w:pPr>
-        <w:spacing w:before="0" w:after="0"/>
-      </w:pPr>
-      <w:r>
-        <w:rPr>
-          <w:rFonts w:ascii="Consolas" w:hAnsi="Consolas" w:cs="Consolas"/>
-          <w:sz w:val="20"/>
-          <w:szCs w:val="20"/>
-        </w:rPr>
-        <w:t xml:space="preserve">        gnn_w = 1.0 - ann_w</w:t>
-      </w:r>
-    </w:p>
-    <w:p>
-      <w:pPr>
-        <w:spacing w:before="0" w:after="0"/>
-      </w:pPr>
-      <w:r>
-        <w:rPr>
-          <w:rFonts w:ascii="Consolas" w:hAnsi="Consolas" w:cs="Consolas"/>
-          <w:sz w:val="20"/>
-          <w:szCs w:val="20"/>
-        </w:rPr>
-        <w:t xml:space="preserve">        voted = _voting_probs(ann_probs_cal, gnn_probs_cal, ann_w, gnn_w)</w:t>
+        <w:t xml:space="preserve">    for ann_w, lgbm_w, gnn_w in weight_grid:</w:t>
+      </w:r>
+    </w:p>
+    <w:p>
+      <w:pPr>
+        <w:spacing w:before="0" w:after="0"/>
+      </w:pPr>
+      <w:r>
+        <w:rPr>
+          <w:rFonts w:ascii="Consolas" w:hAnsi="Consolas" w:cs="Consolas"/>
+          <w:sz w:val="20"/>
+          <w:szCs w:val="20"/>
+        </w:rPr>
+        <w:t xml:space="preserve">        voted = _voting_probs(ann_probs_cal, lgbm_probs_cal, gnn_probs_cal, ann_w, lgbm_w, gnn_w)</w:t>
       </w:r>
     </w:p>
     <w:p>
@@ -26592,7 +28261,7 @@
           <w:sz w:val="20"/>
           <w:szCs w:val="20"/>
         </w:rPr>
-        <w:t xml:space="preserve">                        np.linspace(lower, upper, 160, dtype=np.float64),</w:t>
+        <w:t xml:space="preserve">                        np.linspace(lower, upper, 80, dtype=np.float64),</w:t>
       </w:r>
     </w:p>
     <w:p>
@@ -27034,6 +28703,19 @@
           <w:sz w:val="20"/>
           <w:szCs w:val="20"/>
         </w:rPr>
+        <w:t xml:space="preserve">                    lgbm_weight=float(lgbm_w),</w:t>
+      </w:r>
+    </w:p>
+    <w:p>
+      <w:pPr>
+        <w:spacing w:before="0" w:after="0"/>
+      </w:pPr>
+      <w:r>
+        <w:rPr>
+          <w:rFonts w:ascii="Consolas" w:hAnsi="Consolas" w:cs="Consolas"/>
+          <w:sz w:val="20"/>
+          <w:szCs w:val="20"/>
+        </w:rPr>
         <w:t xml:space="preserve">                    gnn_weight=float(gnn_w),</w:t>
       </w:r>
     </w:p>
@@ -27073,6 +28755,19 @@
           <w:sz w:val="20"/>
           <w:szCs w:val="20"/>
         </w:rPr>
+        <w:t xml:space="preserve">                    lgbm_transform=lgbm_transform,</w:t>
+      </w:r>
+    </w:p>
+    <w:p>
+      <w:pPr>
+        <w:spacing w:before="0" w:after="0"/>
+      </w:pPr>
+      <w:r>
+        <w:rPr>
+          <w:rFonts w:ascii="Consolas" w:hAnsi="Consolas" w:cs="Consolas"/>
+          <w:sz w:val="20"/>
+          <w:szCs w:val="20"/>
+        </w:rPr>
         <w:t xml:space="preserve">                    gnn_transform=gnn_transform,</w:t>
       </w:r>
     </w:p>
@@ -27138,7 +28833,20 @@
           <w:sz w:val="20"/>
           <w:szCs w:val="20"/>
         </w:rPr>
-        <w:t xml:space="preserve">        f"gnn_weight={best_model.gnn_weight:.2f}, threshold={best_model.threshold:.3f}"</w:t>
+        <w:t xml:space="preserve">        f"lgbm_weight={best_model.lgbm_weight:.2f}, gnn_weight={best_model.gnn_weight:.2f}, "</w:t>
+      </w:r>
+    </w:p>
+    <w:p>
+      <w:pPr>
+        <w:spacing w:before="0" w:after="0"/>
+      </w:pPr>
+      <w:r>
+        <w:rPr>
+          <w:rFonts w:ascii="Consolas" w:hAnsi="Consolas" w:cs="Consolas"/>
+          <w:sz w:val="20"/>
+          <w:szCs w:val="20"/>
+        </w:rPr>
+        <w:t xml:space="preserve">        f"threshold={best_model.threshold:.3f}"</w:t>
       </w:r>
     </w:p>
     <w:p>
@@ -27190,6 +28898,19 @@
           <w:sz w:val="20"/>
           <w:szCs w:val="20"/>
         </w:rPr>
+        <w:t xml:space="preserve">        f"LightGBM: {best_model.lgbm_transform.method}, "</w:t>
+      </w:r>
+    </w:p>
+    <w:p>
+      <w:pPr>
+        <w:spacing w:before="0" w:after="0"/>
+      </w:pPr>
+      <w:r>
+        <w:rPr>
+          <w:rFonts w:ascii="Consolas" w:hAnsi="Consolas" w:cs="Consolas"/>
+          <w:sz w:val="20"/>
+          <w:szCs w:val="20"/>
+        </w:rPr>
         <w:t xml:space="preserve">        f"GNN: {best_model.gnn_transform.method}"</w:t>
       </w:r>
     </w:p>
@@ -27307,7 +29028,7 @@
           <w:sz w:val="20"/>
           <w:szCs w:val="20"/>
         </w:rPr>
-        <w:t xml:space="preserve">def predict_meta(model, ann_probs, gnn_probs):</w:t>
+        <w:t xml:space="preserve">def predict_meta(model, ann_probs, lgbm_probs, gnn_probs):</w:t>
       </w:r>
     </w:p>
     <w:p>
@@ -27333,6 +29054,19 @@
           <w:sz w:val="20"/>
           <w:szCs w:val="20"/>
         </w:rPr>
+        <w:t xml:space="preserve">    lgbm_probs = _to_1d(lgbm_probs)</w:t>
+      </w:r>
+    </w:p>
+    <w:p>
+      <w:pPr>
+        <w:spacing w:before="0" w:after="0"/>
+      </w:pPr>
+      <w:r>
+        <w:rPr>
+          <w:rFonts w:ascii="Consolas" w:hAnsi="Consolas" w:cs="Consolas"/>
+          <w:sz w:val="20"/>
+          <w:szCs w:val="20"/>
+        </w:rPr>
         <w:t xml:space="preserve">    gnn_probs = _to_1d(gnn_probs)</w:t>
       </w:r>
     </w:p>
@@ -27359,6 +29093,19 @@
           <w:sz w:val="20"/>
           <w:szCs w:val="20"/>
         </w:rPr>
+        <w:t xml:space="preserve">    lgbm_probs_cal = _apply_transform(model.lgbm_transform, lgbm_probs)</w:t>
+      </w:r>
+    </w:p>
+    <w:p>
+      <w:pPr>
+        <w:spacing w:before="0" w:after="0"/>
+      </w:pPr>
+      <w:r>
+        <w:rPr>
+          <w:rFonts w:ascii="Consolas" w:hAnsi="Consolas" w:cs="Consolas"/>
+          <w:sz w:val="20"/>
+          <w:szCs w:val="20"/>
+        </w:rPr>
         <w:t xml:space="preserve">    gnn_probs_cal = _apply_transform(model.gnn_transform, gnn_probs)</w:t>
       </w:r>
     </w:p>
@@ -27372,7 +29119,33 @@
           <w:sz w:val="20"/>
           <w:szCs w:val="20"/>
         </w:rPr>
-        <w:t xml:space="preserve">    return _voting_probs(ann_probs_cal, gnn_probs_cal, model.ann_weight, model.gnn_weight)</w:t>
+        <w:t xml:space="preserve">    return _voting_probs(</w:t>
+      </w:r>
+    </w:p>
+    <w:p>
+      <w:pPr>
+        <w:spacing w:before="0" w:after="0"/>
+      </w:pPr>
+      <w:r>
+        <w:rPr>
+          <w:rFonts w:ascii="Consolas" w:hAnsi="Consolas" w:cs="Consolas"/>
+          <w:sz w:val="20"/>
+          <w:szCs w:val="20"/>
+        </w:rPr>
+        <w:t xml:space="preserve">        ann_probs_cal, lgbm_probs_cal, gnn_probs_cal, model.ann_weight, model.lgbm_weight, model.gnn_weight</w:t>
+      </w:r>
+    </w:p>
+    <w:p>
+      <w:pPr>
+        <w:spacing w:before="0" w:after="0"/>
+      </w:pPr>
+      <w:r>
+        <w:rPr>
+          <w:rFonts w:ascii="Consolas" w:hAnsi="Consolas" w:cs="Consolas"/>
+          <w:sz w:val="20"/>
+          <w:szCs w:val="20"/>
+        </w:rPr>
+        <w:t xml:space="preserve">    )</w:t>
       </w:r>
     </w:p>
     <w:p>
@@ -28308,6 +30081,240 @@
         <w:pStyle w:val="Heading2"/>
       </w:pPr>
       <w:r>
+        <w:t xml:space="preserve">src\lgbm_model.py</w:t>
+      </w:r>
+    </w:p>
+    <w:p>
+      <w:pPr>
+        <w:spacing w:before="0" w:after="0"/>
+      </w:pPr>
+      <w:r>
+        <w:rPr>
+          <w:rFonts w:ascii="Consolas" w:hAnsi="Consolas" w:cs="Consolas"/>
+          <w:sz w:val="20"/>
+          <w:szCs w:val="20"/>
+        </w:rPr>
+        <w:t xml:space="preserve">from lightgbm import LGBMClassifier</w:t>
+      </w:r>
+    </w:p>
+    <w:p>
+      <w:pPr>
+        <w:spacing w:before="0" w:after="0"/>
+      </w:pPr>
+      <w:r>
+        <w:rPr>
+          <w:rFonts w:ascii="Consolas" w:hAnsi="Consolas" w:cs="Consolas"/>
+          <w:sz w:val="20"/>
+          <w:szCs w:val="20"/>
+        </w:rPr>
+        <w:t xml:space="preserve"/>
+      </w:r>
+    </w:p>
+    <w:p>
+      <w:pPr>
+        <w:spacing w:before="0" w:after="0"/>
+      </w:pPr>
+      <w:r>
+        <w:rPr>
+          <w:rFonts w:ascii="Consolas" w:hAnsi="Consolas" w:cs="Consolas"/>
+          <w:sz w:val="20"/>
+          <w:szCs w:val="20"/>
+        </w:rPr>
+        <w:t xml:space="preserve"/>
+      </w:r>
+    </w:p>
+    <w:p>
+      <w:pPr>
+        <w:spacing w:before="0" w:after="0"/>
+      </w:pPr>
+      <w:r>
+        <w:rPr>
+          <w:rFonts w:ascii="Consolas" w:hAnsi="Consolas" w:cs="Consolas"/>
+          <w:sz w:val="20"/>
+          <w:szCs w:val="20"/>
+        </w:rPr>
+        <w:t xml:space="preserve">def build_lgbm_model(pos_weight, n_estimators=400, random_state=42):</w:t>
+      </w:r>
+    </w:p>
+    <w:p>
+      <w:pPr>
+        <w:spacing w:before="0" w:after="0"/>
+      </w:pPr>
+      <w:r>
+        <w:rPr>
+          <w:rFonts w:ascii="Consolas" w:hAnsi="Consolas" w:cs="Consolas"/>
+          <w:sz w:val="20"/>
+          <w:szCs w:val="20"/>
+        </w:rPr>
+        <w:t xml:space="preserve">    return LGBMClassifier(</w:t>
+      </w:r>
+    </w:p>
+    <w:p>
+      <w:pPr>
+        <w:spacing w:before="0" w:after="0"/>
+      </w:pPr>
+      <w:r>
+        <w:rPr>
+          <w:rFonts w:ascii="Consolas" w:hAnsi="Consolas" w:cs="Consolas"/>
+          <w:sz w:val="20"/>
+          <w:szCs w:val="20"/>
+        </w:rPr>
+        <w:t xml:space="preserve">        n_estimators=n_estimators,</w:t>
+      </w:r>
+    </w:p>
+    <w:p>
+      <w:pPr>
+        <w:spacing w:before="0" w:after="0"/>
+      </w:pPr>
+      <w:r>
+        <w:rPr>
+          <w:rFonts w:ascii="Consolas" w:hAnsi="Consolas" w:cs="Consolas"/>
+          <w:sz w:val="20"/>
+          <w:szCs w:val="20"/>
+        </w:rPr>
+        <w:t xml:space="preserve">        learning_rate=0.05,</w:t>
+      </w:r>
+    </w:p>
+    <w:p>
+      <w:pPr>
+        <w:spacing w:before="0" w:after="0"/>
+      </w:pPr>
+      <w:r>
+        <w:rPr>
+          <w:rFonts w:ascii="Consolas" w:hAnsi="Consolas" w:cs="Consolas"/>
+          <w:sz w:val="20"/>
+          <w:szCs w:val="20"/>
+        </w:rPr>
+        <w:t xml:space="preserve">        num_leaves=63,</w:t>
+      </w:r>
+    </w:p>
+    <w:p>
+      <w:pPr>
+        <w:spacing w:before="0" w:after="0"/>
+      </w:pPr>
+      <w:r>
+        <w:rPr>
+          <w:rFonts w:ascii="Consolas" w:hAnsi="Consolas" w:cs="Consolas"/>
+          <w:sz w:val="20"/>
+          <w:szCs w:val="20"/>
+        </w:rPr>
+        <w:t xml:space="preserve">        subsample=0.8,</w:t>
+      </w:r>
+    </w:p>
+    <w:p>
+      <w:pPr>
+        <w:spacing w:before="0" w:after="0"/>
+      </w:pPr>
+      <w:r>
+        <w:rPr>
+          <w:rFonts w:ascii="Consolas" w:hAnsi="Consolas" w:cs="Consolas"/>
+          <w:sz w:val="20"/>
+          <w:szCs w:val="20"/>
+        </w:rPr>
+        <w:t xml:space="preserve">        colsample_bytree=0.8,</w:t>
+      </w:r>
+    </w:p>
+    <w:p>
+      <w:pPr>
+        <w:spacing w:before="0" w:after="0"/>
+      </w:pPr>
+      <w:r>
+        <w:rPr>
+          <w:rFonts w:ascii="Consolas" w:hAnsi="Consolas" w:cs="Consolas"/>
+          <w:sz w:val="20"/>
+          <w:szCs w:val="20"/>
+        </w:rPr>
+        <w:t xml:space="preserve">        min_child_samples=20,</w:t>
+      </w:r>
+    </w:p>
+    <w:p>
+      <w:pPr>
+        <w:spacing w:before="0" w:after="0"/>
+      </w:pPr>
+      <w:r>
+        <w:rPr>
+          <w:rFonts w:ascii="Consolas" w:hAnsi="Consolas" w:cs="Consolas"/>
+          <w:sz w:val="20"/>
+          <w:szCs w:val="20"/>
+        </w:rPr>
+        <w:t xml:space="preserve">        scale_pos_weight=float(pos_weight),</w:t>
+      </w:r>
+    </w:p>
+    <w:p>
+      <w:pPr>
+        <w:spacing w:before="0" w:after="0"/>
+      </w:pPr>
+      <w:r>
+        <w:rPr>
+          <w:rFonts w:ascii="Consolas" w:hAnsi="Consolas" w:cs="Consolas"/>
+          <w:sz w:val="20"/>
+          <w:szCs w:val="20"/>
+        </w:rPr>
+        <w:t xml:space="preserve">        random_state=random_state,</w:t>
+      </w:r>
+    </w:p>
+    <w:p>
+      <w:pPr>
+        <w:spacing w:before="0" w:after="0"/>
+      </w:pPr>
+      <w:r>
+        <w:rPr>
+          <w:rFonts w:ascii="Consolas" w:hAnsi="Consolas" w:cs="Consolas"/>
+          <w:sz w:val="20"/>
+          <w:szCs w:val="20"/>
+        </w:rPr>
+        <w:t xml:space="preserve">        n_jobs=-1,</w:t>
+      </w:r>
+    </w:p>
+    <w:p>
+      <w:pPr>
+        <w:spacing w:before="0" w:after="0"/>
+      </w:pPr>
+      <w:r>
+        <w:rPr>
+          <w:rFonts w:ascii="Consolas" w:hAnsi="Consolas" w:cs="Consolas"/>
+          <w:sz w:val="20"/>
+          <w:szCs w:val="20"/>
+        </w:rPr>
+        <w:t xml:space="preserve">        verbosity=-1,</w:t>
+      </w:r>
+    </w:p>
+    <w:p>
+      <w:pPr>
+        <w:spacing w:before="0" w:after="0"/>
+      </w:pPr>
+      <w:r>
+        <w:rPr>
+          <w:rFonts w:ascii="Consolas" w:hAnsi="Consolas" w:cs="Consolas"/>
+          <w:sz w:val="20"/>
+          <w:szCs w:val="20"/>
+        </w:rPr>
+        <w:t xml:space="preserve">    )</w:t>
+      </w:r>
+    </w:p>
+    <w:p>
+      <w:pPr>
+        <w:spacing w:before="0" w:after="0"/>
+      </w:pPr>
+      <w:r>
+        <w:rPr>
+          <w:rFonts w:ascii="Consolas" w:hAnsi="Consolas" w:cs="Consolas"/>
+          <w:sz w:val="20"/>
+          <w:szCs w:val="20"/>
+        </w:rPr>
+        <w:t xml:space="preserve"/>
+      </w:r>
+    </w:p>
+    <w:p>
+      <w:r>
+        <w:t xml:space="preserve"/>
+      </w:r>
+    </w:p>
+    <w:p>
+      <w:pPr>
+        <w:pStyle w:val="Heading2"/>
+      </w:pPr>
+      <w:r>
         <w:t xml:space="preserve">src\plots.py</w:t>
       </w:r>
     </w:p>
@@ -29244,6 +31251,32 @@
           <w:sz w:val="20"/>
           <w:szCs w:val="20"/>
         </w:rPr>
+        <w:t xml:space="preserve">    with open(os.path.join(models_dir, "lgbm_model.pkl"), "rb") as f:</w:t>
+      </w:r>
+    </w:p>
+    <w:p>
+      <w:pPr>
+        <w:spacing w:before="0" w:after="0"/>
+      </w:pPr>
+      <w:r>
+        <w:rPr>
+          <w:rFonts w:ascii="Consolas" w:hAnsi="Consolas" w:cs="Consolas"/>
+          <w:sz w:val="20"/>
+          <w:szCs w:val="20"/>
+        </w:rPr>
+        <w:t xml:space="preserve">        lgbm_model = pickle.load(f)</w:t>
+      </w:r>
+    </w:p>
+    <w:p>
+      <w:pPr>
+        <w:spacing w:before="0" w:after="0"/>
+      </w:pPr>
+      <w:r>
+        <w:rPr>
+          <w:rFonts w:ascii="Consolas" w:hAnsi="Consolas" w:cs="Consolas"/>
+          <w:sz w:val="20"/>
+          <w:szCs w:val="20"/>
+        </w:rPr>
         <w:t xml:space="preserve"/>
       </w:r>
     </w:p>
@@ -29400,6 +31433,32 @@
           <w:sz w:val="20"/>
           <w:szCs w:val="20"/>
         </w:rPr>
+        <w:t xml:space="preserve">    lgbm_probs = lgbm_model.predict_proba(X_all_np)[:, 1]</w:t>
+      </w:r>
+    </w:p>
+    <w:p>
+      <w:pPr>
+        <w:spacing w:before="0" w:after="0"/>
+      </w:pPr>
+      <w:r>
+        <w:rPr>
+          <w:rFonts w:ascii="Consolas" w:hAnsi="Consolas" w:cs="Consolas"/>
+          <w:sz w:val="20"/>
+          <w:szCs w:val="20"/>
+        </w:rPr>
+        <w:t xml:space="preserve"/>
+      </w:r>
+    </w:p>
+    <w:p>
+      <w:pPr>
+        <w:spacing w:before="0" w:after="0"/>
+      </w:pPr>
+      <w:r>
+        <w:rPr>
+          <w:rFonts w:ascii="Consolas" w:hAnsi="Consolas" w:cs="Consolas"/>
+          <w:sz w:val="20"/>
+          <w:szCs w:val="20"/>
+        </w:rPr>
         <w:t xml:space="preserve">    adjacency, node_features, _, from_idx_np, to_idx_np = build_graph_data(df)</w:t>
       </w:r>
     </w:p>
@@ -29660,7 +31719,7 @@
           <w:sz w:val="20"/>
           <w:szCs w:val="20"/>
         </w:rPr>
-        <w:t xml:space="preserve">    probs = predict_meta(meta_model, ann_probs, gnn_probs)</w:t>
+        <w:t xml:space="preserve">    probs = predict_meta(meta_model, ann_probs, lgbm_probs, gnn_probs)</w:t>
       </w:r>
     </w:p>
     <w:p>
@@ -30297,6 +32356,19 @@
           <w:sz w:val="20"/>
           <w:szCs w:val="20"/>
         </w:rPr>
+        <w:t xml:space="preserve">from src.lgbm_model import build_lgbm_model</w:t>
+      </w:r>
+    </w:p>
+    <w:p>
+      <w:pPr>
+        <w:spacing w:before="0" w:after="0"/>
+      </w:pPr>
+      <w:r>
+        <w:rPr>
+          <w:rFonts w:ascii="Consolas" w:hAnsi="Consolas" w:cs="Consolas"/>
+          <w:sz w:val="20"/>
+          <w:szCs w:val="20"/>
+        </w:rPr>
         <w:t xml:space="preserve">from src.gnn import GNNTransactionClassifier</w:t>
       </w:r>
     </w:p>
@@ -30778,6 +32850,84 @@
           <w:sz w:val="20"/>
           <w:szCs w:val="20"/>
         </w:rPr>
+        <w:t xml:space="preserve">def _train_lgbm(model, X_train, y_train, X_val, y_val):</w:t>
+      </w:r>
+    </w:p>
+    <w:p>
+      <w:pPr>
+        <w:spacing w:before="0" w:after="0"/>
+      </w:pPr>
+      <w:r>
+        <w:rPr>
+          <w:rFonts w:ascii="Consolas" w:hAnsi="Consolas" w:cs="Consolas"/>
+          <w:sz w:val="20"/>
+          <w:szCs w:val="20"/>
+        </w:rPr>
+        <w:t xml:space="preserve">    model.fit(X_train, y_train, eval_X=X_val, eval_y=y_val, eval_metric="auc")</w:t>
+      </w:r>
+    </w:p>
+    <w:p>
+      <w:pPr>
+        <w:spacing w:before="0" w:after="0"/>
+      </w:pPr>
+      <w:r>
+        <w:rPr>
+          <w:rFonts w:ascii="Consolas" w:hAnsi="Consolas" w:cs="Consolas"/>
+          <w:sz w:val="20"/>
+          <w:szCs w:val="20"/>
+        </w:rPr>
+        <w:t xml:space="preserve">    val_probs = model.predict_proba(X_val)[:, 1]</w:t>
+      </w:r>
+    </w:p>
+    <w:p>
+      <w:pPr>
+        <w:spacing w:before="0" w:after="0"/>
+      </w:pPr>
+      <w:r>
+        <w:rPr>
+          <w:rFonts w:ascii="Consolas" w:hAnsi="Consolas" w:cs="Consolas"/>
+          <w:sz w:val="20"/>
+          <w:szCs w:val="20"/>
+        </w:rPr>
+        <w:t xml:space="preserve">    return val_probs</w:t>
+      </w:r>
+    </w:p>
+    <w:p>
+      <w:pPr>
+        <w:spacing w:before="0" w:after="0"/>
+      </w:pPr>
+      <w:r>
+        <w:rPr>
+          <w:rFonts w:ascii="Consolas" w:hAnsi="Consolas" w:cs="Consolas"/>
+          <w:sz w:val="20"/>
+          <w:szCs w:val="20"/>
+        </w:rPr>
+        <w:t xml:space="preserve"/>
+      </w:r>
+    </w:p>
+    <w:p>
+      <w:pPr>
+        <w:spacing w:before="0" w:after="0"/>
+      </w:pPr>
+      <w:r>
+        <w:rPr>
+          <w:rFonts w:ascii="Consolas" w:hAnsi="Consolas" w:cs="Consolas"/>
+          <w:sz w:val="20"/>
+          <w:szCs w:val="20"/>
+        </w:rPr>
+        <w:t xml:space="preserve"/>
+      </w:r>
+    </w:p>
+    <w:p>
+      <w:pPr>
+        <w:spacing w:before="0" w:after="0"/>
+      </w:pPr>
+      <w:r>
+        <w:rPr>
+          <w:rFonts w:ascii="Consolas" w:hAnsi="Consolas" w:cs="Consolas"/>
+          <w:sz w:val="20"/>
+          <w:szCs w:val="20"/>
+        </w:rPr>
         <w:t xml:space="preserve">def _train_ann(model, train_loader, val_tensor, y_val, epochs, pos_weight, device):</w:t>
       </w:r>
     </w:p>
@@ -30856,7 +33006,7 @@
           <w:sz w:val="20"/>
           <w:szCs w:val="20"/>
         </w:rPr>
-        <w:t xml:space="preserve">        print(f"\nANN Epoch {epoch_num+1}/{epochs}") # Corrected f-string syntax with double escaped newline</w:t>
+        <w:t xml:space="preserve">        print(f"\nANN Epoch {epoch_num+1}/{epochs}")</w:t>
       </w:r>
     </w:p>
     <w:p>
@@ -32169,6 +34319,19 @@
           <w:sz w:val="20"/>
           <w:szCs w:val="20"/>
         </w:rPr>
+        <w:t xml:space="preserve">    lgbm_rounds=400,</w:t>
+      </w:r>
+    </w:p>
+    <w:p>
+      <w:pPr>
+        <w:spacing w:before="0" w:after="0"/>
+      </w:pPr>
+      <w:r>
+        <w:rPr>
+          <w:rFonts w:ascii="Consolas" w:hAnsi="Consolas" w:cs="Consolas"/>
+          <w:sz w:val="20"/>
+          <w:szCs w:val="20"/>
+        </w:rPr>
         <w:t xml:space="preserve">    epochs_gnn=8,</w:t>
       </w:r>
     </w:p>
@@ -32819,98 +34982,111 @@
           <w:sz w:val="20"/>
           <w:szCs w:val="20"/>
         </w:rPr>
-        <w:t xml:space="preserve">    X_train_all = preprocessor.transform(X_train_df)</w:t>
-      </w:r>
-    </w:p>
-    <w:p>
-      <w:pPr>
-        <w:spacing w:before="0" w:after="0"/>
-      </w:pPr>
-      <w:r>
-        <w:rPr>
-          <w:rFonts w:ascii="Consolas" w:hAnsi="Consolas" w:cs="Consolas"/>
-          <w:sz w:val="20"/>
-          <w:szCs w:val="20"/>
-        </w:rPr>
-        <w:t xml:space="preserve">    X_eval_all = preprocessor.transform(X_eval_df)</w:t>
-      </w:r>
-    </w:p>
-    <w:p>
-      <w:pPr>
-        <w:spacing w:before="0" w:after="0"/>
-      </w:pPr>
-      <w:r>
-        <w:rPr>
-          <w:rFonts w:ascii="Consolas" w:hAnsi="Consolas" w:cs="Consolas"/>
-          <w:sz w:val="20"/>
-          <w:szCs w:val="20"/>
-        </w:rPr>
-        <w:t xml:space="preserve"/>
-      </w:r>
-    </w:p>
-    <w:p>
-      <w:pPr>
-        <w:spacing w:before="0" w:after="0"/>
-      </w:pPr>
-      <w:r>
-        <w:rPr>
-          <w:rFonts w:ascii="Consolas" w:hAnsi="Consolas" w:cs="Consolas"/>
-          <w:sz w:val="20"/>
-          <w:szCs w:val="20"/>
-        </w:rPr>
-        <w:t xml:space="preserve">    X_train = torch.tensor(X_train, dtype=torch.float32)</w:t>
-      </w:r>
-    </w:p>
-    <w:p>
-      <w:pPr>
-        <w:spacing w:before="0" w:after="0"/>
-      </w:pPr>
-      <w:r>
-        <w:rPr>
-          <w:rFonts w:ascii="Consolas" w:hAnsi="Consolas" w:cs="Consolas"/>
-          <w:sz w:val="20"/>
-          <w:szCs w:val="20"/>
-        </w:rPr>
-        <w:t xml:space="preserve">    X_val = torch.tensor(X_val, dtype=torch.float32)</w:t>
-      </w:r>
-    </w:p>
-    <w:p>
-      <w:pPr>
-        <w:spacing w:before="0" w:after="0"/>
-      </w:pPr>
-      <w:r>
-        <w:rPr>
-          <w:rFonts w:ascii="Consolas" w:hAnsi="Consolas" w:cs="Consolas"/>
-          <w:sz w:val="20"/>
-          <w:szCs w:val="20"/>
-        </w:rPr>
-        <w:t xml:space="preserve">    X_test = torch.tensor(X_test, dtype=torch.float32)</w:t>
-      </w:r>
-    </w:p>
-    <w:p>
-      <w:pPr>
-        <w:spacing w:before="0" w:after="0"/>
-      </w:pPr>
-      <w:r>
-        <w:rPr>
-          <w:rFonts w:ascii="Consolas" w:hAnsi="Consolas" w:cs="Consolas"/>
-          <w:sz w:val="20"/>
-          <w:szCs w:val="20"/>
-        </w:rPr>
-        <w:t xml:space="preserve">    X_train_all = torch.tensor(X_train_all, dtype=torch.float32)</w:t>
-      </w:r>
-    </w:p>
-    <w:p>
-      <w:pPr>
-        <w:spacing w:before="0" w:after="0"/>
-      </w:pPr>
-      <w:r>
-        <w:rPr>
-          <w:rFonts w:ascii="Consolas" w:hAnsi="Consolas" w:cs="Consolas"/>
-          <w:sz w:val="20"/>
-          <w:szCs w:val="20"/>
-        </w:rPr>
-        <w:t xml:space="preserve">    X_eval_all = torch.tensor(X_eval_all, dtype=torch.float32)</w:t>
+        <w:t xml:space="preserve">    X_train_all_np = preprocessor.transform(X_train_df)</w:t>
+      </w:r>
+    </w:p>
+    <w:p>
+      <w:pPr>
+        <w:spacing w:before="0" w:after="0"/>
+      </w:pPr>
+      <w:r>
+        <w:rPr>
+          <w:rFonts w:ascii="Consolas" w:hAnsi="Consolas" w:cs="Consolas"/>
+          <w:sz w:val="20"/>
+          <w:szCs w:val="20"/>
+        </w:rPr>
+        <w:t xml:space="preserve">    X_eval_all_np = preprocessor.transform(X_eval_df)</w:t>
+      </w:r>
+    </w:p>
+    <w:p>
+      <w:pPr>
+        <w:spacing w:before="0" w:after="0"/>
+      </w:pPr>
+      <w:r>
+        <w:rPr>
+          <w:rFonts w:ascii="Consolas" w:hAnsi="Consolas" w:cs="Consolas"/>
+          <w:sz w:val="20"/>
+          <w:szCs w:val="20"/>
+        </w:rPr>
+        <w:t xml:space="preserve"/>
+      </w:r>
+    </w:p>
+    <w:p>
+      <w:pPr>
+        <w:spacing w:before="0" w:after="0"/>
+      </w:pPr>
+      <w:r>
+        <w:rPr>
+          <w:rFonts w:ascii="Consolas" w:hAnsi="Consolas" w:cs="Consolas"/>
+          <w:sz w:val="20"/>
+          <w:szCs w:val="20"/>
+        </w:rPr>
+        <w:t xml:space="preserve">    # ANN training and GNN edge classifier consume these as tensors.</w:t>
+      </w:r>
+    </w:p>
+    <w:p>
+      <w:pPr>
+        <w:spacing w:before="0" w:after="0"/>
+      </w:pPr>
+      <w:r>
+        <w:rPr>
+          <w:rFonts w:ascii="Consolas" w:hAnsi="Consolas" w:cs="Consolas"/>
+          <w:sz w:val="20"/>
+          <w:szCs w:val="20"/>
+        </w:rPr>
+        <w:t xml:space="preserve">    X_train_tensor = torch.tensor(X_train, dtype=torch.float32)</w:t>
+      </w:r>
+    </w:p>
+    <w:p>
+      <w:pPr>
+        <w:spacing w:before="0" w:after="0"/>
+      </w:pPr>
+      <w:r>
+        <w:rPr>
+          <w:rFonts w:ascii="Consolas" w:hAnsi="Consolas" w:cs="Consolas"/>
+          <w:sz w:val="20"/>
+          <w:szCs w:val="20"/>
+        </w:rPr>
+        <w:t xml:space="preserve">    X_val_tensor = torch.tensor(X_val, dtype=torch.float32)</w:t>
+      </w:r>
+    </w:p>
+    <w:p>
+      <w:pPr>
+        <w:spacing w:before="0" w:after="0"/>
+      </w:pPr>
+      <w:r>
+        <w:rPr>
+          <w:rFonts w:ascii="Consolas" w:hAnsi="Consolas" w:cs="Consolas"/>
+          <w:sz w:val="20"/>
+          <w:szCs w:val="20"/>
+        </w:rPr>
+        <w:t xml:space="preserve">    X_test_tensor = torch.tensor(X_test, dtype=torch.float32)</w:t>
+      </w:r>
+    </w:p>
+    <w:p>
+      <w:pPr>
+        <w:spacing w:before="0" w:after="0"/>
+      </w:pPr>
+      <w:r>
+        <w:rPr>
+          <w:rFonts w:ascii="Consolas" w:hAnsi="Consolas" w:cs="Consolas"/>
+          <w:sz w:val="20"/>
+          <w:szCs w:val="20"/>
+        </w:rPr>
+        <w:t xml:space="preserve">    X_train_all = torch.tensor(X_train_all_np, dtype=torch.float32)</w:t>
+      </w:r>
+    </w:p>
+    <w:p>
+      <w:pPr>
+        <w:spacing w:before="0" w:after="0"/>
+      </w:pPr>
+      <w:r>
+        <w:rPr>
+          <w:rFonts w:ascii="Consolas" w:hAnsi="Consolas" w:cs="Consolas"/>
+          <w:sz w:val="20"/>
+          <w:szCs w:val="20"/>
+        </w:rPr>
+        <w:t xml:space="preserve">    X_eval_all = torch.tensor(X_eval_all_np, dtype=torch.float32)</w:t>
       </w:r>
     </w:p>
     <w:p>
@@ -32962,19 +35138,6 @@
           <w:sz w:val="20"/>
           <w:szCs w:val="20"/>
         </w:rPr>
-        <w:t xml:space="preserve">    y_test_tensor = torch.tensor(y_test, dtype=torch.float32)</w:t>
-      </w:r>
-    </w:p>
-    <w:p>
-      <w:pPr>
-        <w:spacing w:before="0" w:after="0"/>
-      </w:pPr>
-      <w:r>
-        <w:rPr>
-          <w:rFonts w:ascii="Consolas" w:hAnsi="Consolas" w:cs="Consolas"/>
-          <w:sz w:val="20"/>
-          <w:szCs w:val="20"/>
-        </w:rPr>
         <w:t xml:space="preserve">    y_train_all_tensor = torch.tensor(y_train_all, dtype=torch.float32)</w:t>
       </w:r>
     </w:p>
@@ -32988,19 +35151,6 @@
           <w:sz w:val="20"/>
           <w:szCs w:val="20"/>
         </w:rPr>
-        <w:t xml:space="preserve">    y_eval_all_tensor = torch.tensor(y_eval_all, dtype=torch.float32)</w:t>
-      </w:r>
-    </w:p>
-    <w:p>
-      <w:pPr>
-        <w:spacing w:before="0" w:after="0"/>
-      </w:pPr>
-      <w:r>
-        <w:rPr>
-          <w:rFonts w:ascii="Consolas" w:hAnsi="Consolas" w:cs="Consolas"/>
-          <w:sz w:val="20"/>
-          <w:szCs w:val="20"/>
-        </w:rPr>
         <w:t xml:space="preserve"/>
       </w:r>
     </w:p>
@@ -33079,7 +35229,7 @@
           <w:sz w:val="20"/>
           <w:szCs w:val="20"/>
         </w:rPr>
-        <w:t xml:space="preserve">    print(f"Capped pos_weight_value (ANN/ensemble): {capped_pos_weight_value:.2f}")</w:t>
+        <w:t xml:space="preserve">    print(f"Capped pos_weight_value (ANN/LightGBM/ensemble): {capped_pos_weight_value:.2f}")</w:t>
       </w:r>
     </w:p>
     <w:p>
@@ -33144,7 +35294,33 @@
           <w:sz w:val="20"/>
           <w:szCs w:val="20"/>
         </w:rPr>
-        <w:t xml:space="preserve">    ann_model = ANNModel(X_train.shape[1])</w:t>
+        <w:t xml:space="preserve">    device = torch.device("cuda" if torch.cuda.is_available() else "cpu")</w:t>
+      </w:r>
+    </w:p>
+    <w:p>
+      <w:pPr>
+        <w:spacing w:before="0" w:after="0"/>
+      </w:pPr>
+      <w:r>
+        <w:rPr>
+          <w:rFonts w:ascii="Consolas" w:hAnsi="Consolas" w:cs="Consolas"/>
+          <w:sz w:val="20"/>
+          <w:szCs w:val="20"/>
+        </w:rPr>
+        <w:t xml:space="preserve"/>
+      </w:r>
+    </w:p>
+    <w:p>
+      <w:pPr>
+        <w:spacing w:before="0" w:after="0"/>
+      </w:pPr>
+      <w:r>
+        <w:rPr>
+          <w:rFonts w:ascii="Consolas" w:hAnsi="Consolas" w:cs="Consolas"/>
+          <w:sz w:val="20"/>
+          <w:szCs w:val="20"/>
+        </w:rPr>
+        <w:t xml:space="preserve">    ann_model = ANNModel(X_train_tensor.shape[1])</w:t>
       </w:r>
     </w:p>
     <w:p>
@@ -33170,7 +35346,7 @@
           <w:sz w:val="20"/>
           <w:szCs w:val="20"/>
         </w:rPr>
-        <w:t xml:space="preserve">        TensorDataset(X_train, y_train_tensor), batch_size=batch_size, shuffle=True</w:t>
+        <w:t xml:space="preserve">        TensorDataset(X_train_tensor, y_train_tensor), batch_size=batch_size, shuffle=True</w:t>
       </w:r>
     </w:p>
     <w:p>
@@ -33196,33 +35372,46 @@
           <w:sz w:val="20"/>
           <w:szCs w:val="20"/>
         </w:rPr>
-        <w:t xml:space="preserve"/>
-      </w:r>
-    </w:p>
-    <w:p>
-      <w:pPr>
-        <w:spacing w:before="0" w:after="0"/>
-      </w:pPr>
-      <w:r>
-        <w:rPr>
-          <w:rFonts w:ascii="Consolas" w:hAnsi="Consolas" w:cs="Consolas"/>
-          <w:sz w:val="20"/>
-          <w:szCs w:val="20"/>
-        </w:rPr>
-        <w:t xml:space="preserve">    device = torch.device("cuda" if torch.cuda.is_available() else "cpu")</w:t>
-      </w:r>
-    </w:p>
-    <w:p>
-      <w:pPr>
-        <w:spacing w:before="0" w:after="0"/>
-      </w:pPr>
-      <w:r>
-        <w:rPr>
-          <w:rFonts w:ascii="Consolas" w:hAnsi="Consolas" w:cs="Consolas"/>
-          <w:sz w:val="20"/>
-          <w:szCs w:val="20"/>
-        </w:rPr>
-        <w:t xml:space="preserve">    val_ann_probs = _train_ann(ann_model, ann_loader, X_val, y_val_tensor, epochs_ann, pos_weight, device)</w:t>
+        <w:t xml:space="preserve">    val_ann_probs = _train_ann(ann_model, ann_loader, X_val_tensor, y_val_tensor, epochs_ann, pos_weight, device)</w:t>
+      </w:r>
+    </w:p>
+    <w:p>
+      <w:pPr>
+        <w:spacing w:before="0" w:after="0"/>
+      </w:pPr>
+      <w:r>
+        <w:rPr>
+          <w:rFonts w:ascii="Consolas" w:hAnsi="Consolas" w:cs="Consolas"/>
+          <w:sz w:val="20"/>
+          <w:szCs w:val="20"/>
+        </w:rPr>
+        <w:t xml:space="preserve"/>
+      </w:r>
+    </w:p>
+    <w:p>
+      <w:pPr>
+        <w:spacing w:before="0" w:after="0"/>
+      </w:pPr>
+      <w:r>
+        <w:rPr>
+          <w:rFonts w:ascii="Consolas" w:hAnsi="Consolas" w:cs="Consolas"/>
+          <w:sz w:val="20"/>
+          <w:szCs w:val="20"/>
+        </w:rPr>
+        <w:t xml:space="preserve">    lgbm_model = build_lgbm_model(capped_pos_weight_value, n_estimators=lgbm_rounds, random_state=random_state)</w:t>
+      </w:r>
+    </w:p>
+    <w:p>
+      <w:pPr>
+        <w:spacing w:before="0" w:after="0"/>
+      </w:pPr>
+      <w:r>
+        <w:rPr>
+          <w:rFonts w:ascii="Consolas" w:hAnsi="Consolas" w:cs="Consolas"/>
+          <w:sz w:val="20"/>
+          <w:szCs w:val="20"/>
+        </w:rPr>
+        <w:t xml:space="preserve">    val_lgbm_probs = _train_lgbm(lgbm_model, X_train, y_train, X_val, y_val)</w:t>
       </w:r>
     </w:p>
     <w:p>
@@ -33846,7 +36035,7 @@
           <w:sz w:val="20"/>
           <w:szCs w:val="20"/>
         </w:rPr>
-        <w:t xml:space="preserve">    meta_model = train_meta_model(val_ann_probs, val_gnn_probs, y_val, min_precision=min_precision)</w:t>
+        <w:t xml:space="preserve">    meta_model = train_meta_model(val_ann_probs, val_lgbm_probs, val_gnn_probs, y_val, min_precision=min_precision)</w:t>
       </w:r>
     </w:p>
     <w:p>
@@ -33885,7 +36074,7 @@
           <w:sz w:val="20"/>
           <w:szCs w:val="20"/>
         </w:rPr>
-        <w:t xml:space="preserve">    val_meta_probs = predict_meta(meta_model, val_ann_probs, val_gnn_probs)</w:t>
+        <w:t xml:space="preserve">    val_meta_probs = predict_meta(meta_model, val_ann_probs, val_lgbm_probs, val_gnn_probs)</w:t>
       </w:r>
     </w:p>
     <w:p>
@@ -34236,6 +36425,45 @@
           <w:sz w:val="20"/>
           <w:szCs w:val="20"/>
         </w:rPr>
+        <w:t xml:space="preserve">    lgbm_optimal_threshold, lgbm_best_f1, lgbm_best_precision, lgbm_best_recall = _best_f1_threshold(</w:t>
+      </w:r>
+    </w:p>
+    <w:p>
+      <w:pPr>
+        <w:spacing w:before="0" w:after="0"/>
+      </w:pPr>
+      <w:r>
+        <w:rPr>
+          <w:rFonts w:ascii="Consolas" w:hAnsi="Consolas" w:cs="Consolas"/>
+          <w:sz w:val="20"/>
+          <w:szCs w:val="20"/>
+        </w:rPr>
+        <w:t xml:space="preserve">        loaded_y_val, val_lgbm_probs</w:t>
+      </w:r>
+    </w:p>
+    <w:p>
+      <w:pPr>
+        <w:spacing w:before="0" w:after="0"/>
+      </w:pPr>
+      <w:r>
+        <w:rPr>
+          <w:rFonts w:ascii="Consolas" w:hAnsi="Consolas" w:cs="Consolas"/>
+          <w:sz w:val="20"/>
+          <w:szCs w:val="20"/>
+        </w:rPr>
+        <w:t xml:space="preserve">    )</w:t>
+      </w:r>
+    </w:p>
+    <w:p>
+      <w:pPr>
+        <w:spacing w:before="0" w:after="0"/>
+      </w:pPr>
+      <w:r>
+        <w:rPr>
+          <w:rFonts w:ascii="Consolas" w:hAnsi="Consolas" w:cs="Consolas"/>
+          <w:sz w:val="20"/>
+          <w:szCs w:val="20"/>
+        </w:rPr>
         <w:t xml:space="preserve">    gnn_optimal_threshold, gnn_best_f1, gnn_best_precision, gnn_best_recall = _best_f1_threshold(</w:t>
       </w:r>
     </w:p>
@@ -34405,6 +36633,58 @@
           <w:sz w:val="20"/>
           <w:szCs w:val="20"/>
         </w:rPr>
+        <w:t xml:space="preserve">        f"LightGBM validation threshold={lgbm_optimal_threshold:.3f} -&gt; "</w:t>
+      </w:r>
+    </w:p>
+    <w:p>
+      <w:pPr>
+        <w:spacing w:before="0" w:after="0"/>
+      </w:pPr>
+      <w:r>
+        <w:rPr>
+          <w:rFonts w:ascii="Consolas" w:hAnsi="Consolas" w:cs="Consolas"/>
+          <w:sz w:val="20"/>
+          <w:szCs w:val="20"/>
+        </w:rPr>
+        <w:t xml:space="preserve">        f"f1={lgbm_best_f1:.4f}, recall={lgbm_best_recall:.4f}, precision={lgbm_best_precision:.4f}"</w:t>
+      </w:r>
+    </w:p>
+    <w:p>
+      <w:pPr>
+        <w:spacing w:before="0" w:after="0"/>
+      </w:pPr>
+      <w:r>
+        <w:rPr>
+          <w:rFonts w:ascii="Consolas" w:hAnsi="Consolas" w:cs="Consolas"/>
+          <w:sz w:val="20"/>
+          <w:szCs w:val="20"/>
+        </w:rPr>
+        <w:t xml:space="preserve">    )</w:t>
+      </w:r>
+    </w:p>
+    <w:p>
+      <w:pPr>
+        <w:spacing w:before="0" w:after="0"/>
+      </w:pPr>
+      <w:r>
+        <w:rPr>
+          <w:rFonts w:ascii="Consolas" w:hAnsi="Consolas" w:cs="Consolas"/>
+          <w:sz w:val="20"/>
+          <w:szCs w:val="20"/>
+        </w:rPr>
+        <w:t xml:space="preserve">    print(</w:t>
+      </w:r>
+    </w:p>
+    <w:p>
+      <w:pPr>
+        <w:spacing w:before="0" w:after="0"/>
+      </w:pPr>
+      <w:r>
+        <w:rPr>
+          <w:rFonts w:ascii="Consolas" w:hAnsi="Consolas" w:cs="Consolas"/>
+          <w:sz w:val="20"/>
+          <w:szCs w:val="20"/>
+        </w:rPr>
         <w:t xml:space="preserve">        f"GNN validation threshold={gnn_optimal_threshold:.3f} -&gt; "</w:t>
       </w:r>
     </w:p>
@@ -34600,7 +36880,7 @@
           <w:sz w:val="20"/>
           <w:szCs w:val="20"/>
         </w:rPr>
-        <w:t xml:space="preserve">        test_ann_logits = ann_model(X_test.to(device))</w:t>
+        <w:t xml:space="preserve">        test_ann_logits = ann_model(X_test_tensor.to(device))</w:t>
       </w:r>
     </w:p>
     <w:p>
@@ -34769,20 +37049,33 @@
           <w:sz w:val="20"/>
           <w:szCs w:val="20"/>
         </w:rPr>
-        <w:t xml:space="preserve"/>
-      </w:r>
-    </w:p>
-    <w:p>
-      <w:pPr>
-        <w:spacing w:before="0" w:after="0"/>
-      </w:pPr>
-      <w:r>
-        <w:rPr>
-          <w:rFonts w:ascii="Consolas" w:hAnsi="Consolas" w:cs="Consolas"/>
-          <w:sz w:val="20"/>
-          <w:szCs w:val="20"/>
-        </w:rPr>
-        <w:t xml:space="preserve">    test_meta_probs = predict_meta(meta_model, test_ann_probs, test_gnn_probs)</w:t>
+        <w:t xml:space="preserve">    test_lgbm_probs = lgbm_model.predict_proba(X_test)[:, 1]</w:t>
+      </w:r>
+    </w:p>
+    <w:p>
+      <w:pPr>
+        <w:spacing w:before="0" w:after="0"/>
+      </w:pPr>
+      <w:r>
+        <w:rPr>
+          <w:rFonts w:ascii="Consolas" w:hAnsi="Consolas" w:cs="Consolas"/>
+          <w:sz w:val="20"/>
+          <w:szCs w:val="20"/>
+        </w:rPr>
+        <w:t xml:space="preserve"/>
+      </w:r>
+    </w:p>
+    <w:p>
+      <w:pPr>
+        <w:spacing w:before="0" w:after="0"/>
+      </w:pPr>
+      <w:r>
+        <w:rPr>
+          <w:rFonts w:ascii="Consolas" w:hAnsi="Consolas" w:cs="Consolas"/>
+          <w:sz w:val="20"/>
+          <w:szCs w:val="20"/>
+        </w:rPr>
+        <w:t xml:space="preserve">    test_meta_probs = predict_meta(meta_model, test_ann_probs, test_lgbm_probs, test_gnn_probs)</w:t>
       </w:r>
     </w:p>
     <w:p>
@@ -34834,6 +37127,19 @@
           <w:sz w:val="20"/>
           <w:szCs w:val="20"/>
         </w:rPr>
+        <w:t xml:space="preserve">    lgbm_metrics = compute_metrics(y_test, test_lgbm_probs, threshold=lgbm_optimal_threshold)</w:t>
+      </w:r>
+    </w:p>
+    <w:p>
+      <w:pPr>
+        <w:spacing w:before="0" w:after="0"/>
+      </w:pPr>
+      <w:r>
+        <w:rPr>
+          <w:rFonts w:ascii="Consolas" w:hAnsi="Consolas" w:cs="Consolas"/>
+          <w:sz w:val="20"/>
+          <w:szCs w:val="20"/>
+        </w:rPr>
         <w:t xml:space="preserve">    gnn_metrics = compute_metrics(y_test, test_gnn_probs, threshold=gnn_optimal_threshold)</w:t>
       </w:r>
     </w:p>
@@ -34951,6 +37257,19 @@
           <w:sz w:val="20"/>
           <w:szCs w:val="20"/>
         </w:rPr>
+        <w:t xml:space="preserve">            {"model": "lgbm", **lgbm_metrics, "threshold": float(lgbm_optimal_threshold)},</w:t>
+      </w:r>
+    </w:p>
+    <w:p>
+      <w:pPr>
+        <w:spacing w:before="0" w:after="0"/>
+      </w:pPr>
+      <w:r>
+        <w:rPr>
+          <w:rFonts w:ascii="Consolas" w:hAnsi="Consolas" w:cs="Consolas"/>
+          <w:sz w:val="20"/>
+          <w:szCs w:val="20"/>
+        </w:rPr>
         <w:t xml:space="preserve">            {"model": "gnn", **gnn_metrics, "threshold": float(gnn_optimal_threshold)},</w:t>
       </w:r>
     </w:p>
@@ -35172,6 +37491,45 @@
           <w:sz w:val="20"/>
           <w:szCs w:val="20"/>
         </w:rPr>
+        <w:t xml:space="preserve">    with open(os.path.join(models_dir, "lgbm_model.pkl"), "wb") as f:</w:t>
+      </w:r>
+    </w:p>
+    <w:p>
+      <w:pPr>
+        <w:spacing w:before="0" w:after="0"/>
+      </w:pPr>
+      <w:r>
+        <w:rPr>
+          <w:rFonts w:ascii="Consolas" w:hAnsi="Consolas" w:cs="Consolas"/>
+          <w:sz w:val="20"/>
+          <w:szCs w:val="20"/>
+        </w:rPr>
+        <w:t xml:space="preserve">        pickle.dump(lgbm_model, f)</w:t>
+      </w:r>
+    </w:p>
+    <w:p>
+      <w:pPr>
+        <w:spacing w:before="0" w:after="0"/>
+      </w:pPr>
+      <w:r>
+        <w:rPr>
+          <w:rFonts w:ascii="Consolas" w:hAnsi="Consolas" w:cs="Consolas"/>
+          <w:sz w:val="20"/>
+          <w:szCs w:val="20"/>
+        </w:rPr>
+        <w:t xml:space="preserve"/>
+      </w:r>
+    </w:p>
+    <w:p>
+      <w:pPr>
+        <w:spacing w:before="0" w:after="0"/>
+      </w:pPr>
+      <w:r>
+        <w:rPr>
+          <w:rFonts w:ascii="Consolas" w:hAnsi="Consolas" w:cs="Consolas"/>
+          <w:sz w:val="20"/>
+          <w:szCs w:val="20"/>
+        </w:rPr>
         <w:t xml:space="preserve">    with open(os.path.join(models_dir, "preprocessor.pkl"), "wb") as f:</w:t>
       </w:r>
     </w:p>
@@ -35458,6 +37816,19 @@
           <w:sz w:val="20"/>
           <w:szCs w:val="20"/>
         </w:rPr>
+        <w:t xml:space="preserve">        "lgbm_input_dim": int(X_train.shape[1]),</w:t>
+      </w:r>
+    </w:p>
+    <w:p>
+      <w:pPr>
+        <w:spacing w:before="0" w:after="0"/>
+      </w:pPr>
+      <w:r>
+        <w:rPr>
+          <w:rFonts w:ascii="Consolas" w:hAnsi="Consolas" w:cs="Consolas"/>
+          <w:sz w:val="20"/>
+          <w:szCs w:val="20"/>
+        </w:rPr>
         <w:t xml:space="preserve">        "hash_dim": int(hash_dim),</w:t>
       </w:r>
     </w:p>
@@ -35744,6 +38115,19 @@
           <w:sz w:val="20"/>
           <w:szCs w:val="20"/>
         </w:rPr>
+        <w:t xml:space="preserve">            "lgbm": lgbm_metrics,</w:t>
+      </w:r>
+    </w:p>
+    <w:p>
+      <w:pPr>
+        <w:spacing w:before="0" w:after="0"/>
+      </w:pPr>
+      <w:r>
+        <w:rPr>
+          <w:rFonts w:ascii="Consolas" w:hAnsi="Consolas" w:cs="Consolas"/>
+          <w:sz w:val="20"/>
+          <w:szCs w:val="20"/>
+        </w:rPr>
         <w:t xml:space="preserve">            "gnn": gnn_metrics,</w:t>
       </w:r>
     </w:p>
@@ -37018,7 +39402,7 @@
           <w:sz w:val="20"/>
           <w:szCs w:val="20"/>
         </w:rPr>
-        <w:t xml:space="preserve">    lines.append("- src/: model + pipeline code (loader, ANN, GNN, ensemble, training)")</w:t>
+        <w:t xml:space="preserve">    lines.append("- src/: model + pipeline code (loader, ANN, LightGBM, GNN, ensemble, training)")</w:t>
       </w:r>
     </w:p>
     <w:p>

</xml_diff>